<commit_message>
Structure du site : la typographie du site passe en chapitre 1
Le document décrivait la mise en forme de lui-même, pas celle des pages.
Le chapitre 1 donne désormais les trois familles employées par le site,
la taille de chaque niveau de titre en pixels sur mobile et sur grand
écran, la graisse et l'interligne, relevés dans la feuille de style et
non estimés.

Les tirets longs ont été retirés de tous les textes.
</commit_message>
<xml_diff>
--- a/docs/KossKoss-Select-Structure-du-site.docx
+++ b/docs/KossKoss-Select-Structure-du-site.docx
@@ -171,7 +171,7 @@
                 <w:color w:val="1E1E1E"/>
                 <w:sz w:val="20"/>
               </w:rPr>
-              <w:t>KossKoss Select — concept-store cosmétique multimarque</w:t>
+              <w:t>KossKoss Select, concept-store cosmétique multimarque</w:t>
             </w:r>
           </w:p>
         </w:tc>
@@ -217,7 +217,7 @@
                 <w:color w:val="1E1E1E"/>
                 <w:sz w:val="20"/>
               </w:rPr>
-              <w:t>Cameroun — vente 100 % en ligne</w:t>
+              <w:t>Cameroun, vente 100 % en ligne</w:t>
             </w:r>
           </w:p>
         </w:tc>
@@ -501,7 +501,7 @@
           <w:color w:val="1E1E1E"/>
           <w:sz w:val="22"/>
         </w:rPr>
-        <w:t>Objet du document et principes de lecture</w:t>
+        <w:t>Typographie du site</w:t>
       </w:r>
     </w:p>
     <w:p>
@@ -528,7 +528,7 @@
           <w:color w:val="1E1E1E"/>
           <w:sz w:val="22"/>
         </w:rPr>
-        <w:t>Vue d'ensemble de l'arborescence</w:t>
+        <w:t>Objet du document et principes de lecture</w:t>
       </w:r>
     </w:p>
     <w:p>
@@ -555,7 +555,7 @@
           <w:color w:val="1E1E1E"/>
           <w:sz w:val="22"/>
         </w:rPr>
-        <w:t>Espace public — la boutique</w:t>
+        <w:t>Vue d'ensemble de l'arborescence</w:t>
       </w:r>
     </w:p>
     <w:p>
@@ -582,7 +582,7 @@
           <w:color w:val="1E1E1E"/>
           <w:sz w:val="22"/>
         </w:rPr>
-        <w:t>Espace client — le compte</w:t>
+        <w:t>Espace public : la boutique</w:t>
       </w:r>
     </w:p>
     <w:p>
@@ -609,7 +609,7 @@
           <w:color w:val="1E1E1E"/>
           <w:sz w:val="22"/>
         </w:rPr>
-        <w:t>Le tunnel d'achat</w:t>
+        <w:t>Espace client : le compte</w:t>
       </w:r>
     </w:p>
     <w:p>
@@ -636,7 +636,7 @@
           <w:color w:val="1E1E1E"/>
           <w:sz w:val="22"/>
         </w:rPr>
-        <w:t>Le Journal — espace éditorial</w:t>
+        <w:t>Le tunnel d'achat</w:t>
       </w:r>
     </w:p>
     <w:p>
@@ -663,7 +663,7 @@
           <w:color w:val="1E1E1E"/>
           <w:sz w:val="22"/>
         </w:rPr>
-        <w:t>Pages légales et informatives</w:t>
+        <w:t>Le Journal : espace éditorial</w:t>
       </w:r>
     </w:p>
     <w:p>
@@ -690,7 +690,7 @@
           <w:color w:val="1E1E1E"/>
           <w:sz w:val="22"/>
         </w:rPr>
-        <w:t>Back-office — l'administration</w:t>
+        <w:t>Pages légales et informatives</w:t>
       </w:r>
     </w:p>
     <w:p>
@@ -717,7 +717,7 @@
           <w:color w:val="1E1E1E"/>
           <w:sz w:val="22"/>
         </w:rPr>
-        <w:t>Le bilinguisme et les adresses</w:t>
+        <w:t>Back-office : l'administration</w:t>
       </w:r>
     </w:p>
     <w:p>
@@ -744,7 +744,7 @@
           <w:color w:val="1E1E1E"/>
           <w:sz w:val="22"/>
         </w:rPr>
-        <w:t>Charte typographique et graphique</w:t>
+        <w:t>Le bilinguisme et les adresses</w:t>
       </w:r>
     </w:p>
     <w:p>
@@ -762,6 +762,33 @@
           <w:sz w:val="22"/>
         </w:rPr>
         <w:t xml:space="preserve">11.  </w:t>
+      </w:r>
+      <w:r>
+        <w:rPr>
+          <w:rFonts w:ascii="Montserrat" w:hAnsi="Montserrat" w:eastAsia="Montserrat" w:cs="Montserrat"/>
+          <w:b w:val="0"/>
+          <w:i w:val="0"/>
+          <w:color w:val="1E1E1E"/>
+          <w:sz w:val="22"/>
+        </w:rPr>
+        <w:t>Charte graphique et mise en forme du document</w:t>
+      </w:r>
+    </w:p>
+    <w:p>
+      <w:pPr>
+        <w:spacing w:lineRule="auto" w:line="360" w:before="0" w:after="40"/>
+        <w:ind w:left="340"/>
+        <w:jc w:val="left"/>
+      </w:pPr>
+      <w:r>
+        <w:rPr>
+          <w:rFonts w:ascii="Montserrat" w:hAnsi="Montserrat" w:eastAsia="Montserrat" w:cs="Montserrat"/>
+          <w:b/>
+          <w:i w:val="0"/>
+          <w:color w:val="0F3B46"/>
+          <w:sz w:val="22"/>
+        </w:rPr>
+        <w:t xml:space="preserve">12.  </w:t>
       </w:r>
       <w:r>
         <w:rPr>
@@ -796,6 +823,2201 @@
           <w:sz w:val="32"/>
         </w:rPr>
         <w:t xml:space="preserve">1. </w:t>
+      </w:r>
+      <w:r>
+        <w:rPr>
+          <w:rFonts w:ascii="Montserrat" w:hAnsi="Montserrat" w:eastAsia="Montserrat" w:cs="Montserrat"/>
+          <w:b/>
+          <w:i w:val="0"/>
+          <w:color w:val="0F3B46"/>
+          <w:sz w:val="32"/>
+        </w:rPr>
+        <w:t>TYPOGRAPHIE DU SITE</w:t>
+      </w:r>
+    </w:p>
+    <w:p>
+      <w:pPr>
+        <w:spacing w:lineRule="auto" w:line="360" w:before="0" w:after="120"/>
+        <w:jc w:val="both"/>
+      </w:pPr>
+      <w:r>
+        <w:rPr>
+          <w:rFonts w:ascii="Montserrat" w:hAnsi="Montserrat" w:eastAsia="Montserrat" w:cs="Montserrat"/>
+          <w:b w:val="0"/>
+          <w:i w:val="0"/>
+          <w:color w:val="1E1E1E"/>
+          <w:sz w:val="22"/>
+        </w:rPr>
+        <w:t>Ce chapitre donne la typographie appliquée aux pages du site : les familles utilisées, la taille de chaque niveau de titre, la graisse et l'interligne. Les valeurs sont relevées dans la feuille de style du site, elles ne sont pas indicatives.</w:t>
+      </w:r>
+    </w:p>
+    <w:p>
+      <w:pPr>
+        <w:spacing w:lineRule="auto" w:line="360" w:before="240" w:after="80"/>
+        <w:jc w:val="left"/>
+      </w:pPr>
+      <w:r>
+        <w:rPr>
+          <w:rFonts w:ascii="Montserrat" w:hAnsi="Montserrat" w:eastAsia="Montserrat" w:cs="Montserrat"/>
+          <w:b/>
+          <w:i w:val="0"/>
+          <w:color w:val="0F3B46"/>
+          <w:sz w:val="26"/>
+        </w:rPr>
+        <w:t>1.1 Les trois familles de caractères</w:t>
+      </w:r>
+    </w:p>
+    <w:tbl>
+      <w:tblPr>
+        <w:tblStyle w:val="TableGrid"/>
+        <w:tblW w:type="auto" w:w="0"/>
+        <w:jc w:val="center"/>
+        <w:tblLayout w:type="fixed"/>
+        <w:tblLook w:firstColumn="1" w:firstRow="1" w:lastColumn="0" w:lastRow="0" w:noHBand="0" w:noVBand="1" w:val="04A0"/>
+      </w:tblPr>
+      <w:tblGrid>
+        <w:gridCol w:w="3135"/>
+        <w:gridCol w:w="3135"/>
+        <w:gridCol w:w="3135"/>
+      </w:tblGrid>
+      <w:tr>
+        <w:tc>
+          <w:tcPr>
+            <w:tcW w:type="dxa" w:w="2551"/>
+            <w:shd w:val="clear" w:color="auto" w:fill="0F3B46"/>
+          </w:tcPr>
+          <w:p>
+            <w:pPr>
+              <w:spacing w:lineRule="auto" w:line="240" w:before="40" w:after="40"/>
+              <w:jc w:val="left"/>
+            </w:pPr>
+            <w:r/>
+            <w:r>
+              <w:rPr>
+                <w:rFonts w:ascii="Montserrat" w:hAnsi="Montserrat" w:eastAsia="Montserrat" w:cs="Montserrat"/>
+                <w:b/>
+                <w:i w:val="0"/>
+                <w:color w:val="FFFFFF"/>
+                <w:sz w:val="20"/>
+              </w:rPr>
+              <w:t>Famille</w:t>
+            </w:r>
+          </w:p>
+        </w:tc>
+        <w:tc>
+          <w:tcPr>
+            <w:tcW w:type="dxa" w:w="3685"/>
+            <w:shd w:val="clear" w:color="auto" w:fill="0F3B46"/>
+          </w:tcPr>
+          <w:p>
+            <w:pPr>
+              <w:spacing w:lineRule="auto" w:line="240" w:before="40" w:after="40"/>
+              <w:jc w:val="left"/>
+            </w:pPr>
+            <w:r/>
+            <w:r>
+              <w:rPr>
+                <w:rFonts w:ascii="Montserrat" w:hAnsi="Montserrat" w:eastAsia="Montserrat" w:cs="Montserrat"/>
+                <w:b/>
+                <w:i w:val="0"/>
+                <w:color w:val="FFFFFF"/>
+                <w:sz w:val="20"/>
+              </w:rPr>
+              <w:t>Usage</w:t>
+            </w:r>
+          </w:p>
+        </w:tc>
+        <w:tc>
+          <w:tcPr>
+            <w:tcW w:type="dxa" w:w="3118"/>
+            <w:shd w:val="clear" w:color="auto" w:fill="0F3B46"/>
+          </w:tcPr>
+          <w:p>
+            <w:pPr>
+              <w:spacing w:lineRule="auto" w:line="240" w:before="40" w:after="40"/>
+              <w:jc w:val="left"/>
+            </w:pPr>
+            <w:r/>
+            <w:r>
+              <w:rPr>
+                <w:rFonts w:ascii="Montserrat" w:hAnsi="Montserrat" w:eastAsia="Montserrat" w:cs="Montserrat"/>
+                <w:b/>
+                <w:i w:val="0"/>
+                <w:color w:val="FFFFFF"/>
+                <w:sz w:val="20"/>
+              </w:rPr>
+              <w:t>Graisses chargées</w:t>
+            </w:r>
+          </w:p>
+        </w:tc>
+      </w:tr>
+      <w:tr>
+        <w:tc>
+          <w:tcPr>
+            <w:tcW w:type="dxa" w:w="2551"/>
+          </w:tcPr>
+          <w:p>
+            <w:pPr>
+              <w:spacing w:lineRule="auto" w:line="276" w:before="40" w:after="40"/>
+              <w:jc w:val="left"/>
+            </w:pPr>
+            <w:r/>
+            <w:r>
+              <w:rPr>
+                <w:rFonts w:ascii="Montserrat" w:hAnsi="Montserrat" w:eastAsia="Montserrat" w:cs="Montserrat"/>
+                <w:b/>
+                <w:i w:val="0"/>
+                <w:color w:val="1E1E1E"/>
+                <w:sz w:val="20"/>
+              </w:rPr>
+              <w:t>Cinzel</w:t>
+            </w:r>
+          </w:p>
+        </w:tc>
+        <w:tc>
+          <w:tcPr>
+            <w:tcW w:type="dxa" w:w="3685"/>
+          </w:tcPr>
+          <w:p>
+            <w:pPr>
+              <w:spacing w:lineRule="auto" w:line="276" w:before="40" w:after="40"/>
+              <w:jc w:val="left"/>
+            </w:pPr>
+            <w:r/>
+            <w:r>
+              <w:rPr>
+                <w:rFonts w:ascii="Montserrat" w:hAnsi="Montserrat" w:eastAsia="Montserrat" w:cs="Montserrat"/>
+                <w:b w:val="0"/>
+                <w:i w:val="0"/>
+                <w:color w:val="1E1E1E"/>
+                <w:sz w:val="20"/>
+              </w:rPr>
+              <w:t>Logotype uniquement</w:t>
+            </w:r>
+          </w:p>
+        </w:tc>
+        <w:tc>
+          <w:tcPr>
+            <w:tcW w:type="dxa" w:w="3118"/>
+          </w:tcPr>
+          <w:p>
+            <w:pPr>
+              <w:spacing w:lineRule="auto" w:line="276" w:before="40" w:after="40"/>
+              <w:jc w:val="left"/>
+            </w:pPr>
+            <w:r/>
+            <w:r>
+              <w:rPr>
+                <w:rFonts w:ascii="Montserrat" w:hAnsi="Montserrat" w:eastAsia="Montserrat" w:cs="Montserrat"/>
+                <w:b w:val="0"/>
+                <w:i w:val="0"/>
+                <w:color w:val="1E1E1E"/>
+                <w:sz w:val="20"/>
+              </w:rPr>
+              <w:t>500, 600</w:t>
+            </w:r>
+          </w:p>
+        </w:tc>
+      </w:tr>
+      <w:tr>
+        <w:tc>
+          <w:tcPr>
+            <w:tcW w:type="dxa" w:w="2551"/>
+          </w:tcPr>
+          <w:p>
+            <w:pPr>
+              <w:spacing w:lineRule="auto" w:line="276" w:before="40" w:after="40"/>
+              <w:jc w:val="left"/>
+            </w:pPr>
+            <w:r/>
+            <w:r>
+              <w:rPr>
+                <w:rFonts w:ascii="Montserrat" w:hAnsi="Montserrat" w:eastAsia="Montserrat" w:cs="Montserrat"/>
+                <w:b/>
+                <w:i w:val="0"/>
+                <w:color w:val="1E1E1E"/>
+                <w:sz w:val="20"/>
+              </w:rPr>
+              <w:t>Playfair Display</w:t>
+            </w:r>
+          </w:p>
+        </w:tc>
+        <w:tc>
+          <w:tcPr>
+            <w:tcW w:type="dxa" w:w="3685"/>
+          </w:tcPr>
+          <w:p>
+            <w:pPr>
+              <w:spacing w:lineRule="auto" w:line="276" w:before="40" w:after="40"/>
+              <w:jc w:val="left"/>
+            </w:pPr>
+            <w:r/>
+            <w:r>
+              <w:rPr>
+                <w:rFonts w:ascii="Montserrat" w:hAnsi="Montserrat" w:eastAsia="Montserrat" w:cs="Montserrat"/>
+                <w:b w:val="0"/>
+                <w:i w:val="0"/>
+                <w:color w:val="1E1E1E"/>
+                <w:sz w:val="20"/>
+              </w:rPr>
+              <w:t>Titres de niveau 1 à 4</w:t>
+            </w:r>
+          </w:p>
+        </w:tc>
+        <w:tc>
+          <w:tcPr>
+            <w:tcW w:type="dxa" w:w="3118"/>
+          </w:tcPr>
+          <w:p>
+            <w:pPr>
+              <w:spacing w:lineRule="auto" w:line="276" w:before="40" w:after="40"/>
+              <w:jc w:val="left"/>
+            </w:pPr>
+            <w:r/>
+            <w:r>
+              <w:rPr>
+                <w:rFonts w:ascii="Montserrat" w:hAnsi="Montserrat" w:eastAsia="Montserrat" w:cs="Montserrat"/>
+                <w:b w:val="0"/>
+                <w:i w:val="0"/>
+                <w:color w:val="1E1E1E"/>
+                <w:sz w:val="20"/>
+              </w:rPr>
+              <w:t>400, 500, 600</w:t>
+            </w:r>
+          </w:p>
+        </w:tc>
+      </w:tr>
+      <w:tr>
+        <w:tc>
+          <w:tcPr>
+            <w:tcW w:type="dxa" w:w="2551"/>
+          </w:tcPr>
+          <w:p>
+            <w:pPr>
+              <w:spacing w:lineRule="auto" w:line="276" w:before="40" w:after="40"/>
+              <w:jc w:val="left"/>
+            </w:pPr>
+            <w:r/>
+            <w:r>
+              <w:rPr>
+                <w:rFonts w:ascii="Montserrat" w:hAnsi="Montserrat" w:eastAsia="Montserrat" w:cs="Montserrat"/>
+                <w:b/>
+                <w:i w:val="0"/>
+                <w:color w:val="1E1E1E"/>
+                <w:sz w:val="20"/>
+              </w:rPr>
+              <w:t>Manrope</w:t>
+            </w:r>
+          </w:p>
+        </w:tc>
+        <w:tc>
+          <w:tcPr>
+            <w:tcW w:type="dxa" w:w="3685"/>
+          </w:tcPr>
+          <w:p>
+            <w:pPr>
+              <w:spacing w:lineRule="auto" w:line="276" w:before="40" w:after="40"/>
+              <w:jc w:val="left"/>
+            </w:pPr>
+            <w:r/>
+            <w:r>
+              <w:rPr>
+                <w:rFonts w:ascii="Montserrat" w:hAnsi="Montserrat" w:eastAsia="Montserrat" w:cs="Montserrat"/>
+                <w:b w:val="0"/>
+                <w:i w:val="0"/>
+                <w:color w:val="1E1E1E"/>
+                <w:sz w:val="20"/>
+              </w:rPr>
+              <w:t>Texte courant, libellés, prix, boutons</w:t>
+            </w:r>
+          </w:p>
+        </w:tc>
+        <w:tc>
+          <w:tcPr>
+            <w:tcW w:type="dxa" w:w="3118"/>
+          </w:tcPr>
+          <w:p>
+            <w:pPr>
+              <w:spacing w:lineRule="auto" w:line="276" w:before="40" w:after="40"/>
+              <w:jc w:val="left"/>
+            </w:pPr>
+            <w:r/>
+            <w:r>
+              <w:rPr>
+                <w:rFonts w:ascii="Montserrat" w:hAnsi="Montserrat" w:eastAsia="Montserrat" w:cs="Montserrat"/>
+                <w:b w:val="0"/>
+                <w:i w:val="0"/>
+                <w:color w:val="1E1E1E"/>
+                <w:sz w:val="20"/>
+              </w:rPr>
+              <w:t>300, 400, 500, 600, 700</w:t>
+            </w:r>
+          </w:p>
+        </w:tc>
+      </w:tr>
+    </w:tbl>
+    <w:tbl>
+      <w:tblPr>
+        <w:tblW w:type="auto" w:w="0"/>
+        <w:jc w:val="center"/>
+        <w:tblLook w:firstColumn="1" w:firstRow="1" w:lastColumn="0" w:lastRow="0" w:noHBand="0" w:noVBand="1" w:val="04A0"/>
+      </w:tblPr>
+      <w:tblGrid>
+        <w:gridCol w:w="9406"/>
+      </w:tblGrid>
+      <w:tr>
+        <w:tc>
+          <w:tcPr>
+            <w:tcW w:type="dxa" w:w="9354"/>
+            <w:shd w:val="clear" w:color="auto" w:fill="F3E8DD"/>
+            <w:tcBorders>
+              <w:left w:val="single" w:sz="18" w:color="0F3B46"/>
+            </w:tcBorders>
+          </w:tcPr>
+          <w:p>
+            <w:pPr>
+              <w:spacing w:lineRule="auto" w:line="312" w:before="80" w:after="80"/>
+              <w:jc w:val="both"/>
+            </w:pPr>
+            <w:r/>
+            <w:r>
+              <w:rPr>
+                <w:rFonts w:ascii="Montserrat" w:hAnsi="Montserrat" w:eastAsia="Montserrat" w:cs="Montserrat"/>
+                <w:b/>
+                <w:i w:val="0"/>
+                <w:color w:val="0F3B46"/>
+                <w:sz w:val="20"/>
+              </w:rPr>
+              <w:t xml:space="preserve">Note de choix, </w:t>
+            </w:r>
+            <w:r>
+              <w:rPr>
+                <w:rFonts w:ascii="Montserrat" w:hAnsi="Montserrat" w:eastAsia="Montserrat" w:cs="Montserrat"/>
+                <w:b w:val="0"/>
+                <w:i/>
+                <w:color w:val="1E1E1E"/>
+                <w:sz w:val="20"/>
+              </w:rPr>
+              <w:t>Cinzel ne sert qu'au logotype. Cette romaine capitale n'a pas de véritable bas de casse : ses minuscules sont des petites capitales, ce qui rend fidèlement le logo mais rendrait un titre de section pénible à lire et un paragraphe illisible. Les titres reviennent donc à Playfair Display, qui compose en bas de casse et offre plusieurs graisses.</w:t>
+            </w:r>
+          </w:p>
+        </w:tc>
+      </w:tr>
+    </w:tbl>
+    <w:p>
+      <w:pPr>
+        <w:spacing w:after="80"/>
+      </w:pPr>
+    </w:p>
+    <w:tbl>
+      <w:tblPr>
+        <w:tblW w:type="auto" w:w="0"/>
+        <w:jc w:val="center"/>
+        <w:tblLook w:firstColumn="1" w:firstRow="1" w:lastColumn="0" w:lastRow="0" w:noHBand="0" w:noVBand="1" w:val="04A0"/>
+      </w:tblPr>
+      <w:tblGrid>
+        <w:gridCol w:w="9406"/>
+      </w:tblGrid>
+      <w:tr>
+        <w:tc>
+          <w:tcPr>
+            <w:tcW w:type="dxa" w:w="9354"/>
+            <w:shd w:val="clear" w:color="auto" w:fill="F3E8DD"/>
+            <w:tcBorders>
+              <w:left w:val="single" w:sz="18" w:color="0F3B46"/>
+            </w:tcBorders>
+          </w:tcPr>
+          <w:p>
+            <w:pPr>
+              <w:spacing w:lineRule="auto" w:line="312" w:before="80" w:after="80"/>
+              <w:jc w:val="both"/>
+            </w:pPr>
+            <w:r/>
+            <w:r>
+              <w:rPr>
+                <w:rFonts w:ascii="Montserrat" w:hAnsi="Montserrat" w:eastAsia="Montserrat" w:cs="Montserrat"/>
+                <w:b/>
+                <w:i w:val="0"/>
+                <w:color w:val="0F3B46"/>
+                <w:sz w:val="20"/>
+              </w:rPr>
+              <w:t xml:space="preserve">Note de choix, </w:t>
+            </w:r>
+            <w:r>
+              <w:rPr>
+                <w:rFonts w:ascii="Montserrat" w:hAnsi="Montserrat" w:eastAsia="Montserrat" w:cs="Montserrat"/>
+                <w:b w:val="0"/>
+                <w:i/>
+                <w:color w:val="1E1E1E"/>
+                <w:sz w:val="20"/>
+              </w:rPr>
+              <w:t>Manrope remplace Gilroy, la police prévue par la charte. Gilroy est une police commerciale dont la licence web n'a pas encore été acquise. Manrope est libre et visuellement proche. Ce choix reste à confirmer, il figure au dernier chapitre.</w:t>
+            </w:r>
+          </w:p>
+        </w:tc>
+      </w:tr>
+    </w:tbl>
+    <w:p>
+      <w:pPr>
+        <w:spacing w:after="80"/>
+      </w:pPr>
+    </w:p>
+    <w:p>
+      <w:pPr>
+        <w:spacing w:lineRule="auto" w:line="360" w:before="240" w:after="80"/>
+        <w:jc w:val="left"/>
+      </w:pPr>
+      <w:r>
+        <w:rPr>
+          <w:rFonts w:ascii="Montserrat" w:hAnsi="Montserrat" w:eastAsia="Montserrat" w:cs="Montserrat"/>
+          <w:b/>
+          <w:i w:val="0"/>
+          <w:color w:val="0F3B46"/>
+          <w:sz w:val="26"/>
+        </w:rPr>
+        <w:t>1.2 L'échelle des titres et du texte</w:t>
+      </w:r>
+    </w:p>
+    <w:p>
+      <w:pPr>
+        <w:spacing w:lineRule="auto" w:line="360" w:before="0" w:after="120"/>
+        <w:jc w:val="both"/>
+      </w:pPr>
+      <w:r>
+        <w:rPr>
+          <w:rFonts w:ascii="Montserrat" w:hAnsi="Montserrat" w:eastAsia="Montserrat" w:cs="Montserrat"/>
+          <w:b w:val="0"/>
+          <w:i w:val="0"/>
+          <w:color w:val="1E1E1E"/>
+          <w:sz w:val="22"/>
+        </w:rPr>
+        <w:t>Les tailles sont données en pixels. Les titres varient avec la largeur de l'écran : la première valeur s'applique au téléphone, la seconde au grand écran, avec une progression continue entre les deux.</w:t>
+      </w:r>
+    </w:p>
+    <w:tbl>
+      <w:tblPr>
+        <w:tblStyle w:val="TableGrid"/>
+        <w:tblW w:type="auto" w:w="0"/>
+        <w:jc w:val="center"/>
+        <w:tblLayout w:type="fixed"/>
+        <w:tblLook w:firstColumn="1" w:firstRow="1" w:lastColumn="0" w:lastRow="0" w:noHBand="0" w:noVBand="1" w:val="04A0"/>
+      </w:tblPr>
+      <w:tblGrid>
+        <w:gridCol w:w="1568"/>
+        <w:gridCol w:w="1568"/>
+        <w:gridCol w:w="1568"/>
+        <w:gridCol w:w="1568"/>
+        <w:gridCol w:w="1568"/>
+        <w:gridCol w:w="1568"/>
+      </w:tblGrid>
+      <w:tr>
+        <w:tc>
+          <w:tcPr>
+            <w:tcW w:type="dxa" w:w="1474"/>
+            <w:shd w:val="clear" w:color="auto" w:fill="0F3B46"/>
+          </w:tcPr>
+          <w:p>
+            <w:pPr>
+              <w:spacing w:lineRule="auto" w:line="240" w:before="40" w:after="40"/>
+              <w:jc w:val="left"/>
+            </w:pPr>
+            <w:r/>
+            <w:r>
+              <w:rPr>
+                <w:rFonts w:ascii="Montserrat" w:hAnsi="Montserrat" w:eastAsia="Montserrat" w:cs="Montserrat"/>
+                <w:b/>
+                <w:i w:val="0"/>
+                <w:color w:val="FFFFFF"/>
+                <w:sz w:val="18"/>
+              </w:rPr>
+              <w:t>Niveau</w:t>
+            </w:r>
+          </w:p>
+        </w:tc>
+        <w:tc>
+          <w:tcPr>
+            <w:tcW w:type="dxa" w:w="2041"/>
+            <w:shd w:val="clear" w:color="auto" w:fill="0F3B46"/>
+          </w:tcPr>
+          <w:p>
+            <w:pPr>
+              <w:spacing w:lineRule="auto" w:line="240" w:before="40" w:after="40"/>
+              <w:jc w:val="left"/>
+            </w:pPr>
+            <w:r/>
+            <w:r>
+              <w:rPr>
+                <w:rFonts w:ascii="Montserrat" w:hAnsi="Montserrat" w:eastAsia="Montserrat" w:cs="Montserrat"/>
+                <w:b/>
+                <w:i w:val="0"/>
+                <w:color w:val="FFFFFF"/>
+                <w:sz w:val="18"/>
+              </w:rPr>
+              <w:t>Famille</w:t>
+            </w:r>
+          </w:p>
+        </w:tc>
+        <w:tc>
+          <w:tcPr>
+            <w:tcW w:type="dxa" w:w="1417"/>
+            <w:shd w:val="clear" w:color="auto" w:fill="0F3B46"/>
+          </w:tcPr>
+          <w:p>
+            <w:pPr>
+              <w:spacing w:lineRule="auto" w:line="240" w:before="40" w:after="40"/>
+              <w:jc w:val="left"/>
+            </w:pPr>
+            <w:r/>
+            <w:r>
+              <w:rPr>
+                <w:rFonts w:ascii="Montserrat" w:hAnsi="Montserrat" w:eastAsia="Montserrat" w:cs="Montserrat"/>
+                <w:b/>
+                <w:i w:val="0"/>
+                <w:color w:val="FFFFFF"/>
+                <w:sz w:val="18"/>
+              </w:rPr>
+              <w:t>Taille mobile</w:t>
+            </w:r>
+          </w:p>
+        </w:tc>
+        <w:tc>
+          <w:tcPr>
+            <w:tcW w:type="dxa" w:w="1417"/>
+            <w:shd w:val="clear" w:color="auto" w:fill="0F3B46"/>
+          </w:tcPr>
+          <w:p>
+            <w:pPr>
+              <w:spacing w:lineRule="auto" w:line="240" w:before="40" w:after="40"/>
+              <w:jc w:val="left"/>
+            </w:pPr>
+            <w:r/>
+            <w:r>
+              <w:rPr>
+                <w:rFonts w:ascii="Montserrat" w:hAnsi="Montserrat" w:eastAsia="Montserrat" w:cs="Montserrat"/>
+                <w:b/>
+                <w:i w:val="0"/>
+                <w:color w:val="FFFFFF"/>
+                <w:sz w:val="18"/>
+              </w:rPr>
+              <w:t>Taille bureau</w:t>
+            </w:r>
+          </w:p>
+        </w:tc>
+        <w:tc>
+          <w:tcPr>
+            <w:tcW w:type="dxa" w:w="1134"/>
+            <w:shd w:val="clear" w:color="auto" w:fill="0F3B46"/>
+          </w:tcPr>
+          <w:p>
+            <w:pPr>
+              <w:spacing w:lineRule="auto" w:line="240" w:before="40" w:after="40"/>
+              <w:jc w:val="left"/>
+            </w:pPr>
+            <w:r/>
+            <w:r>
+              <w:rPr>
+                <w:rFonts w:ascii="Montserrat" w:hAnsi="Montserrat" w:eastAsia="Montserrat" w:cs="Montserrat"/>
+                <w:b/>
+                <w:i w:val="0"/>
+                <w:color w:val="FFFFFF"/>
+                <w:sz w:val="18"/>
+              </w:rPr>
+              <w:t>Graisse</w:t>
+            </w:r>
+          </w:p>
+        </w:tc>
+        <w:tc>
+          <w:tcPr>
+            <w:tcW w:type="dxa" w:w="1304"/>
+            <w:shd w:val="clear" w:color="auto" w:fill="0F3B46"/>
+          </w:tcPr>
+          <w:p>
+            <w:pPr>
+              <w:spacing w:lineRule="auto" w:line="240" w:before="40" w:after="40"/>
+              <w:jc w:val="left"/>
+            </w:pPr>
+            <w:r/>
+            <w:r>
+              <w:rPr>
+                <w:rFonts w:ascii="Montserrat" w:hAnsi="Montserrat" w:eastAsia="Montserrat" w:cs="Montserrat"/>
+                <w:b/>
+                <w:i w:val="0"/>
+                <w:color w:val="FFFFFF"/>
+                <w:sz w:val="18"/>
+              </w:rPr>
+              <w:t>Interligne</w:t>
+            </w:r>
+          </w:p>
+        </w:tc>
+      </w:tr>
+      <w:tr>
+        <w:tc>
+          <w:tcPr>
+            <w:tcW w:type="dxa" w:w="1474"/>
+          </w:tcPr>
+          <w:p>
+            <w:pPr>
+              <w:spacing w:lineRule="auto" w:line="276" w:before="40" w:after="40"/>
+              <w:jc w:val="left"/>
+            </w:pPr>
+            <w:r/>
+            <w:r>
+              <w:rPr>
+                <w:rFonts w:ascii="Montserrat" w:hAnsi="Montserrat" w:eastAsia="Montserrat" w:cs="Montserrat"/>
+                <w:b/>
+                <w:i w:val="0"/>
+                <w:color w:val="1E1E1E"/>
+                <w:sz w:val="18"/>
+              </w:rPr>
+              <w:t>Titre 1</w:t>
+            </w:r>
+          </w:p>
+        </w:tc>
+        <w:tc>
+          <w:tcPr>
+            <w:tcW w:type="dxa" w:w="2041"/>
+          </w:tcPr>
+          <w:p>
+            <w:pPr>
+              <w:spacing w:lineRule="auto" w:line="276" w:before="40" w:after="40"/>
+              <w:jc w:val="left"/>
+            </w:pPr>
+            <w:r/>
+            <w:r>
+              <w:rPr>
+                <w:rFonts w:ascii="Montserrat" w:hAnsi="Montserrat" w:eastAsia="Montserrat" w:cs="Montserrat"/>
+                <w:b w:val="0"/>
+                <w:i w:val="0"/>
+                <w:color w:val="1E1E1E"/>
+                <w:sz w:val="18"/>
+              </w:rPr>
+              <w:t>Playfair Display</w:t>
+            </w:r>
+          </w:p>
+        </w:tc>
+        <w:tc>
+          <w:tcPr>
+            <w:tcW w:type="dxa" w:w="1417"/>
+          </w:tcPr>
+          <w:p>
+            <w:pPr>
+              <w:spacing w:lineRule="auto" w:line="276" w:before="40" w:after="40"/>
+              <w:jc w:val="left"/>
+            </w:pPr>
+            <w:r/>
+            <w:r>
+              <w:rPr>
+                <w:rFonts w:ascii="Montserrat" w:hAnsi="Montserrat" w:eastAsia="Montserrat" w:cs="Montserrat"/>
+                <w:b w:val="0"/>
+                <w:i w:val="0"/>
+                <w:color w:val="1E1E1E"/>
+                <w:sz w:val="18"/>
+              </w:rPr>
+              <w:t>40 px</w:t>
+            </w:r>
+          </w:p>
+        </w:tc>
+        <w:tc>
+          <w:tcPr>
+            <w:tcW w:type="dxa" w:w="1417"/>
+          </w:tcPr>
+          <w:p>
+            <w:pPr>
+              <w:spacing w:lineRule="auto" w:line="276" w:before="40" w:after="40"/>
+              <w:jc w:val="left"/>
+            </w:pPr>
+            <w:r/>
+            <w:r>
+              <w:rPr>
+                <w:rFonts w:ascii="Montserrat" w:hAnsi="Montserrat" w:eastAsia="Montserrat" w:cs="Montserrat"/>
+                <w:b w:val="0"/>
+                <w:i w:val="0"/>
+                <w:color w:val="1E1E1E"/>
+                <w:sz w:val="18"/>
+              </w:rPr>
+              <w:t>54 px</w:t>
+            </w:r>
+          </w:p>
+        </w:tc>
+        <w:tc>
+          <w:tcPr>
+            <w:tcW w:type="dxa" w:w="1134"/>
+          </w:tcPr>
+          <w:p>
+            <w:pPr>
+              <w:spacing w:lineRule="auto" w:line="276" w:before="40" w:after="40"/>
+              <w:jc w:val="left"/>
+            </w:pPr>
+            <w:r/>
+            <w:r>
+              <w:rPr>
+                <w:rFonts w:ascii="Montserrat" w:hAnsi="Montserrat" w:eastAsia="Montserrat" w:cs="Montserrat"/>
+                <w:b w:val="0"/>
+                <w:i w:val="0"/>
+                <w:color w:val="1E1E1E"/>
+                <w:sz w:val="18"/>
+              </w:rPr>
+              <w:t>600</w:t>
+            </w:r>
+          </w:p>
+        </w:tc>
+        <w:tc>
+          <w:tcPr>
+            <w:tcW w:type="dxa" w:w="1304"/>
+          </w:tcPr>
+          <w:p>
+            <w:pPr>
+              <w:spacing w:lineRule="auto" w:line="276" w:before="40" w:after="40"/>
+              <w:jc w:val="left"/>
+            </w:pPr>
+            <w:r/>
+            <w:r>
+              <w:rPr>
+                <w:rFonts w:ascii="Montserrat" w:hAnsi="Montserrat" w:eastAsia="Montserrat" w:cs="Montserrat"/>
+                <w:b w:val="0"/>
+                <w:i w:val="0"/>
+                <w:color w:val="1E1E1E"/>
+                <w:sz w:val="18"/>
+              </w:rPr>
+              <w:t>1,10</w:t>
+            </w:r>
+          </w:p>
+        </w:tc>
+      </w:tr>
+      <w:tr>
+        <w:tc>
+          <w:tcPr>
+            <w:tcW w:type="dxa" w:w="1474"/>
+          </w:tcPr>
+          <w:p>
+            <w:pPr>
+              <w:spacing w:lineRule="auto" w:line="276" w:before="40" w:after="40"/>
+              <w:jc w:val="left"/>
+            </w:pPr>
+            <w:r/>
+            <w:r>
+              <w:rPr>
+                <w:rFonts w:ascii="Montserrat" w:hAnsi="Montserrat" w:eastAsia="Montserrat" w:cs="Montserrat"/>
+                <w:b/>
+                <w:i w:val="0"/>
+                <w:color w:val="1E1E1E"/>
+                <w:sz w:val="18"/>
+              </w:rPr>
+              <w:t>Titre 2</w:t>
+            </w:r>
+          </w:p>
+        </w:tc>
+        <w:tc>
+          <w:tcPr>
+            <w:tcW w:type="dxa" w:w="2041"/>
+          </w:tcPr>
+          <w:p>
+            <w:pPr>
+              <w:spacing w:lineRule="auto" w:line="276" w:before="40" w:after="40"/>
+              <w:jc w:val="left"/>
+            </w:pPr>
+            <w:r/>
+            <w:r>
+              <w:rPr>
+                <w:rFonts w:ascii="Montserrat" w:hAnsi="Montserrat" w:eastAsia="Montserrat" w:cs="Montserrat"/>
+                <w:b w:val="0"/>
+                <w:i w:val="0"/>
+                <w:color w:val="1E1E1E"/>
+                <w:sz w:val="18"/>
+              </w:rPr>
+              <w:t>Playfair Display</w:t>
+            </w:r>
+          </w:p>
+        </w:tc>
+        <w:tc>
+          <w:tcPr>
+            <w:tcW w:type="dxa" w:w="1417"/>
+          </w:tcPr>
+          <w:p>
+            <w:pPr>
+              <w:spacing w:lineRule="auto" w:line="276" w:before="40" w:after="40"/>
+              <w:jc w:val="left"/>
+            </w:pPr>
+            <w:r/>
+            <w:r>
+              <w:rPr>
+                <w:rFonts w:ascii="Montserrat" w:hAnsi="Montserrat" w:eastAsia="Montserrat" w:cs="Montserrat"/>
+                <w:b w:val="0"/>
+                <w:i w:val="0"/>
+                <w:color w:val="1E1E1E"/>
+                <w:sz w:val="18"/>
+              </w:rPr>
+              <w:t>24 px</w:t>
+            </w:r>
+          </w:p>
+        </w:tc>
+        <w:tc>
+          <w:tcPr>
+            <w:tcW w:type="dxa" w:w="1417"/>
+          </w:tcPr>
+          <w:p>
+            <w:pPr>
+              <w:spacing w:lineRule="auto" w:line="276" w:before="40" w:after="40"/>
+              <w:jc w:val="left"/>
+            </w:pPr>
+            <w:r/>
+            <w:r>
+              <w:rPr>
+                <w:rFonts w:ascii="Montserrat" w:hAnsi="Montserrat" w:eastAsia="Montserrat" w:cs="Montserrat"/>
+                <w:b w:val="0"/>
+                <w:i w:val="0"/>
+                <w:color w:val="1E1E1E"/>
+                <w:sz w:val="18"/>
+              </w:rPr>
+              <w:t>28 px</w:t>
+            </w:r>
+          </w:p>
+        </w:tc>
+        <w:tc>
+          <w:tcPr>
+            <w:tcW w:type="dxa" w:w="1134"/>
+          </w:tcPr>
+          <w:p>
+            <w:pPr>
+              <w:spacing w:lineRule="auto" w:line="276" w:before="40" w:after="40"/>
+              <w:jc w:val="left"/>
+            </w:pPr>
+            <w:r/>
+            <w:r>
+              <w:rPr>
+                <w:rFonts w:ascii="Montserrat" w:hAnsi="Montserrat" w:eastAsia="Montserrat" w:cs="Montserrat"/>
+                <w:b w:val="0"/>
+                <w:i w:val="0"/>
+                <w:color w:val="1E1E1E"/>
+                <w:sz w:val="18"/>
+              </w:rPr>
+              <w:t>500</w:t>
+            </w:r>
+          </w:p>
+        </w:tc>
+        <w:tc>
+          <w:tcPr>
+            <w:tcW w:type="dxa" w:w="1304"/>
+          </w:tcPr>
+          <w:p>
+            <w:pPr>
+              <w:spacing w:lineRule="auto" w:line="276" w:before="40" w:after="40"/>
+              <w:jc w:val="left"/>
+            </w:pPr>
+            <w:r/>
+            <w:r>
+              <w:rPr>
+                <w:rFonts w:ascii="Montserrat" w:hAnsi="Montserrat" w:eastAsia="Montserrat" w:cs="Montserrat"/>
+                <w:b w:val="0"/>
+                <w:i w:val="0"/>
+                <w:color w:val="1E1E1E"/>
+                <w:sz w:val="18"/>
+              </w:rPr>
+              <w:t>1,20</w:t>
+            </w:r>
+          </w:p>
+        </w:tc>
+      </w:tr>
+      <w:tr>
+        <w:tc>
+          <w:tcPr>
+            <w:tcW w:type="dxa" w:w="1474"/>
+          </w:tcPr>
+          <w:p>
+            <w:pPr>
+              <w:spacing w:lineRule="auto" w:line="276" w:before="40" w:after="40"/>
+              <w:jc w:val="left"/>
+            </w:pPr>
+            <w:r/>
+            <w:r>
+              <w:rPr>
+                <w:rFonts w:ascii="Montserrat" w:hAnsi="Montserrat" w:eastAsia="Montserrat" w:cs="Montserrat"/>
+                <w:b/>
+                <w:i w:val="0"/>
+                <w:color w:val="1E1E1E"/>
+                <w:sz w:val="18"/>
+              </w:rPr>
+              <w:t>Titre 3</w:t>
+            </w:r>
+          </w:p>
+        </w:tc>
+        <w:tc>
+          <w:tcPr>
+            <w:tcW w:type="dxa" w:w="2041"/>
+          </w:tcPr>
+          <w:p>
+            <w:pPr>
+              <w:spacing w:lineRule="auto" w:line="276" w:before="40" w:after="40"/>
+              <w:jc w:val="left"/>
+            </w:pPr>
+            <w:r/>
+            <w:r>
+              <w:rPr>
+                <w:rFonts w:ascii="Montserrat" w:hAnsi="Montserrat" w:eastAsia="Montserrat" w:cs="Montserrat"/>
+                <w:b w:val="0"/>
+                <w:i w:val="0"/>
+                <w:color w:val="1E1E1E"/>
+                <w:sz w:val="18"/>
+              </w:rPr>
+              <w:t>Playfair Display</w:t>
+            </w:r>
+          </w:p>
+        </w:tc>
+        <w:tc>
+          <w:tcPr>
+            <w:tcW w:type="dxa" w:w="1417"/>
+          </w:tcPr>
+          <w:p>
+            <w:pPr>
+              <w:spacing w:lineRule="auto" w:line="276" w:before="40" w:after="40"/>
+              <w:jc w:val="left"/>
+            </w:pPr>
+            <w:r/>
+            <w:r>
+              <w:rPr>
+                <w:rFonts w:ascii="Montserrat" w:hAnsi="Montserrat" w:eastAsia="Montserrat" w:cs="Montserrat"/>
+                <w:b w:val="0"/>
+                <w:i w:val="0"/>
+                <w:color w:val="1E1E1E"/>
+                <w:sz w:val="18"/>
+              </w:rPr>
+              <w:t>18 px</w:t>
+            </w:r>
+          </w:p>
+        </w:tc>
+        <w:tc>
+          <w:tcPr>
+            <w:tcW w:type="dxa" w:w="1417"/>
+          </w:tcPr>
+          <w:p>
+            <w:pPr>
+              <w:spacing w:lineRule="auto" w:line="276" w:before="40" w:after="40"/>
+              <w:jc w:val="left"/>
+            </w:pPr>
+            <w:r/>
+            <w:r>
+              <w:rPr>
+                <w:rFonts w:ascii="Montserrat" w:hAnsi="Montserrat" w:eastAsia="Montserrat" w:cs="Montserrat"/>
+                <w:b w:val="0"/>
+                <w:i w:val="0"/>
+                <w:color w:val="1E1E1E"/>
+                <w:sz w:val="18"/>
+              </w:rPr>
+              <w:t>21 px</w:t>
+            </w:r>
+          </w:p>
+        </w:tc>
+        <w:tc>
+          <w:tcPr>
+            <w:tcW w:type="dxa" w:w="1134"/>
+          </w:tcPr>
+          <w:p>
+            <w:pPr>
+              <w:spacing w:lineRule="auto" w:line="276" w:before="40" w:after="40"/>
+              <w:jc w:val="left"/>
+            </w:pPr>
+            <w:r/>
+            <w:r>
+              <w:rPr>
+                <w:rFonts w:ascii="Montserrat" w:hAnsi="Montserrat" w:eastAsia="Montserrat" w:cs="Montserrat"/>
+                <w:b w:val="0"/>
+                <w:i w:val="0"/>
+                <w:color w:val="1E1E1E"/>
+                <w:sz w:val="18"/>
+              </w:rPr>
+              <w:t>500</w:t>
+            </w:r>
+          </w:p>
+        </w:tc>
+        <w:tc>
+          <w:tcPr>
+            <w:tcW w:type="dxa" w:w="1304"/>
+          </w:tcPr>
+          <w:p>
+            <w:pPr>
+              <w:spacing w:lineRule="auto" w:line="276" w:before="40" w:after="40"/>
+              <w:jc w:val="left"/>
+            </w:pPr>
+            <w:r/>
+            <w:r>
+              <w:rPr>
+                <w:rFonts w:ascii="Montserrat" w:hAnsi="Montserrat" w:eastAsia="Montserrat" w:cs="Montserrat"/>
+                <w:b w:val="0"/>
+                <w:i w:val="0"/>
+                <w:color w:val="1E1E1E"/>
+                <w:sz w:val="18"/>
+              </w:rPr>
+              <w:t>1,30</w:t>
+            </w:r>
+          </w:p>
+        </w:tc>
+      </w:tr>
+      <w:tr>
+        <w:tc>
+          <w:tcPr>
+            <w:tcW w:type="dxa" w:w="1474"/>
+          </w:tcPr>
+          <w:p>
+            <w:pPr>
+              <w:spacing w:lineRule="auto" w:line="276" w:before="40" w:after="40"/>
+              <w:jc w:val="left"/>
+            </w:pPr>
+            <w:r/>
+            <w:r>
+              <w:rPr>
+                <w:rFonts w:ascii="Montserrat" w:hAnsi="Montserrat" w:eastAsia="Montserrat" w:cs="Montserrat"/>
+                <w:b/>
+                <w:i w:val="0"/>
+                <w:color w:val="1E1E1E"/>
+                <w:sz w:val="18"/>
+              </w:rPr>
+              <w:t>Titre 4</w:t>
+            </w:r>
+          </w:p>
+        </w:tc>
+        <w:tc>
+          <w:tcPr>
+            <w:tcW w:type="dxa" w:w="2041"/>
+          </w:tcPr>
+          <w:p>
+            <w:pPr>
+              <w:spacing w:lineRule="auto" w:line="276" w:before="40" w:after="40"/>
+              <w:jc w:val="left"/>
+            </w:pPr>
+            <w:r/>
+            <w:r>
+              <w:rPr>
+                <w:rFonts w:ascii="Montserrat" w:hAnsi="Montserrat" w:eastAsia="Montserrat" w:cs="Montserrat"/>
+                <w:b w:val="0"/>
+                <w:i w:val="0"/>
+                <w:color w:val="1E1E1E"/>
+                <w:sz w:val="18"/>
+              </w:rPr>
+              <w:t>Playfair Display</w:t>
+            </w:r>
+          </w:p>
+        </w:tc>
+        <w:tc>
+          <w:tcPr>
+            <w:tcW w:type="dxa" w:w="1417"/>
+          </w:tcPr>
+          <w:p>
+            <w:pPr>
+              <w:spacing w:lineRule="auto" w:line="276" w:before="40" w:after="40"/>
+              <w:jc w:val="left"/>
+            </w:pPr>
+            <w:r/>
+            <w:r>
+              <w:rPr>
+                <w:rFonts w:ascii="Montserrat" w:hAnsi="Montserrat" w:eastAsia="Montserrat" w:cs="Montserrat"/>
+                <w:b w:val="0"/>
+                <w:i w:val="0"/>
+                <w:color w:val="1E1E1E"/>
+                <w:sz w:val="18"/>
+              </w:rPr>
+              <w:t>17 px</w:t>
+            </w:r>
+          </w:p>
+        </w:tc>
+        <w:tc>
+          <w:tcPr>
+            <w:tcW w:type="dxa" w:w="1417"/>
+          </w:tcPr>
+          <w:p>
+            <w:pPr>
+              <w:spacing w:lineRule="auto" w:line="276" w:before="40" w:after="40"/>
+              <w:jc w:val="left"/>
+            </w:pPr>
+            <w:r/>
+            <w:r>
+              <w:rPr>
+                <w:rFonts w:ascii="Montserrat" w:hAnsi="Montserrat" w:eastAsia="Montserrat" w:cs="Montserrat"/>
+                <w:b w:val="0"/>
+                <w:i w:val="0"/>
+                <w:color w:val="1E1E1E"/>
+                <w:sz w:val="18"/>
+              </w:rPr>
+              <w:t>17 px</w:t>
+            </w:r>
+          </w:p>
+        </w:tc>
+        <w:tc>
+          <w:tcPr>
+            <w:tcW w:type="dxa" w:w="1134"/>
+          </w:tcPr>
+          <w:p>
+            <w:pPr>
+              <w:spacing w:lineRule="auto" w:line="276" w:before="40" w:after="40"/>
+              <w:jc w:val="left"/>
+            </w:pPr>
+            <w:r/>
+            <w:r>
+              <w:rPr>
+                <w:rFonts w:ascii="Montserrat" w:hAnsi="Montserrat" w:eastAsia="Montserrat" w:cs="Montserrat"/>
+                <w:b w:val="0"/>
+                <w:i w:val="0"/>
+                <w:color w:val="1E1E1E"/>
+                <w:sz w:val="18"/>
+              </w:rPr>
+              <w:t>600</w:t>
+            </w:r>
+          </w:p>
+        </w:tc>
+        <w:tc>
+          <w:tcPr>
+            <w:tcW w:type="dxa" w:w="1304"/>
+          </w:tcPr>
+          <w:p>
+            <w:pPr>
+              <w:spacing w:lineRule="auto" w:line="276" w:before="40" w:after="40"/>
+              <w:jc w:val="left"/>
+            </w:pPr>
+            <w:r/>
+            <w:r>
+              <w:rPr>
+                <w:rFonts w:ascii="Montserrat" w:hAnsi="Montserrat" w:eastAsia="Montserrat" w:cs="Montserrat"/>
+                <w:b w:val="0"/>
+                <w:i w:val="0"/>
+                <w:color w:val="1E1E1E"/>
+                <w:sz w:val="18"/>
+              </w:rPr>
+              <w:t>1,40</w:t>
+            </w:r>
+          </w:p>
+        </w:tc>
+      </w:tr>
+      <w:tr>
+        <w:tc>
+          <w:tcPr>
+            <w:tcW w:type="dxa" w:w="1474"/>
+          </w:tcPr>
+          <w:p>
+            <w:pPr>
+              <w:spacing w:lineRule="auto" w:line="276" w:before="40" w:after="40"/>
+              <w:jc w:val="left"/>
+            </w:pPr>
+            <w:r/>
+            <w:r>
+              <w:rPr>
+                <w:rFonts w:ascii="Montserrat" w:hAnsi="Montserrat" w:eastAsia="Montserrat" w:cs="Montserrat"/>
+                <w:b/>
+                <w:i w:val="0"/>
+                <w:color w:val="1E1E1E"/>
+                <w:sz w:val="18"/>
+              </w:rPr>
+              <w:t>Chapô</w:t>
+            </w:r>
+          </w:p>
+        </w:tc>
+        <w:tc>
+          <w:tcPr>
+            <w:tcW w:type="dxa" w:w="2041"/>
+          </w:tcPr>
+          <w:p>
+            <w:pPr>
+              <w:spacing w:lineRule="auto" w:line="276" w:before="40" w:after="40"/>
+              <w:jc w:val="left"/>
+            </w:pPr>
+            <w:r/>
+            <w:r>
+              <w:rPr>
+                <w:rFonts w:ascii="Montserrat" w:hAnsi="Montserrat" w:eastAsia="Montserrat" w:cs="Montserrat"/>
+                <w:b w:val="0"/>
+                <w:i w:val="0"/>
+                <w:color w:val="1E1E1E"/>
+                <w:sz w:val="18"/>
+              </w:rPr>
+              <w:t>Manrope</w:t>
+            </w:r>
+          </w:p>
+        </w:tc>
+        <w:tc>
+          <w:tcPr>
+            <w:tcW w:type="dxa" w:w="1417"/>
+          </w:tcPr>
+          <w:p>
+            <w:pPr>
+              <w:spacing w:lineRule="auto" w:line="276" w:before="40" w:after="40"/>
+              <w:jc w:val="left"/>
+            </w:pPr>
+            <w:r/>
+            <w:r>
+              <w:rPr>
+                <w:rFonts w:ascii="Montserrat" w:hAnsi="Montserrat" w:eastAsia="Montserrat" w:cs="Montserrat"/>
+                <w:b w:val="0"/>
+                <w:i w:val="0"/>
+                <w:color w:val="1E1E1E"/>
+                <w:sz w:val="18"/>
+              </w:rPr>
+              <w:t>17 px</w:t>
+            </w:r>
+          </w:p>
+        </w:tc>
+        <w:tc>
+          <w:tcPr>
+            <w:tcW w:type="dxa" w:w="1417"/>
+          </w:tcPr>
+          <w:p>
+            <w:pPr>
+              <w:spacing w:lineRule="auto" w:line="276" w:before="40" w:after="40"/>
+              <w:jc w:val="left"/>
+            </w:pPr>
+            <w:r/>
+            <w:r>
+              <w:rPr>
+                <w:rFonts w:ascii="Montserrat" w:hAnsi="Montserrat" w:eastAsia="Montserrat" w:cs="Montserrat"/>
+                <w:b w:val="0"/>
+                <w:i w:val="0"/>
+                <w:color w:val="1E1E1E"/>
+                <w:sz w:val="18"/>
+              </w:rPr>
+              <w:t>17 px</w:t>
+            </w:r>
+          </w:p>
+        </w:tc>
+        <w:tc>
+          <w:tcPr>
+            <w:tcW w:type="dxa" w:w="1134"/>
+          </w:tcPr>
+          <w:p>
+            <w:pPr>
+              <w:spacing w:lineRule="auto" w:line="276" w:before="40" w:after="40"/>
+              <w:jc w:val="left"/>
+            </w:pPr>
+            <w:r/>
+            <w:r>
+              <w:rPr>
+                <w:rFonts w:ascii="Montserrat" w:hAnsi="Montserrat" w:eastAsia="Montserrat" w:cs="Montserrat"/>
+                <w:b w:val="0"/>
+                <w:i w:val="0"/>
+                <w:color w:val="1E1E1E"/>
+                <w:sz w:val="18"/>
+              </w:rPr>
+              <w:t>500</w:t>
+            </w:r>
+          </w:p>
+        </w:tc>
+        <w:tc>
+          <w:tcPr>
+            <w:tcW w:type="dxa" w:w="1304"/>
+          </w:tcPr>
+          <w:p>
+            <w:pPr>
+              <w:spacing w:lineRule="auto" w:line="276" w:before="40" w:after="40"/>
+              <w:jc w:val="left"/>
+            </w:pPr>
+            <w:r/>
+            <w:r>
+              <w:rPr>
+                <w:rFonts w:ascii="Montserrat" w:hAnsi="Montserrat" w:eastAsia="Montserrat" w:cs="Montserrat"/>
+                <w:b w:val="0"/>
+                <w:i w:val="0"/>
+                <w:color w:val="1E1E1E"/>
+                <w:sz w:val="18"/>
+              </w:rPr>
+              <w:t>1,60</w:t>
+            </w:r>
+          </w:p>
+        </w:tc>
+      </w:tr>
+      <w:tr>
+        <w:tc>
+          <w:tcPr>
+            <w:tcW w:type="dxa" w:w="1474"/>
+          </w:tcPr>
+          <w:p>
+            <w:pPr>
+              <w:spacing w:lineRule="auto" w:line="276" w:before="40" w:after="40"/>
+              <w:jc w:val="left"/>
+            </w:pPr>
+            <w:r/>
+            <w:r>
+              <w:rPr>
+                <w:rFonts w:ascii="Montserrat" w:hAnsi="Montserrat" w:eastAsia="Montserrat" w:cs="Montserrat"/>
+                <w:b/>
+                <w:i w:val="0"/>
+                <w:color w:val="1E1E1E"/>
+                <w:sz w:val="18"/>
+              </w:rPr>
+              <w:t>Paragraphe</w:t>
+            </w:r>
+          </w:p>
+        </w:tc>
+        <w:tc>
+          <w:tcPr>
+            <w:tcW w:type="dxa" w:w="2041"/>
+          </w:tcPr>
+          <w:p>
+            <w:pPr>
+              <w:spacing w:lineRule="auto" w:line="276" w:before="40" w:after="40"/>
+              <w:jc w:val="left"/>
+            </w:pPr>
+            <w:r/>
+            <w:r>
+              <w:rPr>
+                <w:rFonts w:ascii="Montserrat" w:hAnsi="Montserrat" w:eastAsia="Montserrat" w:cs="Montserrat"/>
+                <w:b w:val="0"/>
+                <w:i w:val="0"/>
+                <w:color w:val="1E1E1E"/>
+                <w:sz w:val="18"/>
+              </w:rPr>
+              <w:t>Manrope</w:t>
+            </w:r>
+          </w:p>
+        </w:tc>
+        <w:tc>
+          <w:tcPr>
+            <w:tcW w:type="dxa" w:w="1417"/>
+          </w:tcPr>
+          <w:p>
+            <w:pPr>
+              <w:spacing w:lineRule="auto" w:line="276" w:before="40" w:after="40"/>
+              <w:jc w:val="left"/>
+            </w:pPr>
+            <w:r/>
+            <w:r>
+              <w:rPr>
+                <w:rFonts w:ascii="Montserrat" w:hAnsi="Montserrat" w:eastAsia="Montserrat" w:cs="Montserrat"/>
+                <w:b w:val="0"/>
+                <w:i w:val="0"/>
+                <w:color w:val="1E1E1E"/>
+                <w:sz w:val="18"/>
+              </w:rPr>
+              <w:t>16 px</w:t>
+            </w:r>
+          </w:p>
+        </w:tc>
+        <w:tc>
+          <w:tcPr>
+            <w:tcW w:type="dxa" w:w="1417"/>
+          </w:tcPr>
+          <w:p>
+            <w:pPr>
+              <w:spacing w:lineRule="auto" w:line="276" w:before="40" w:after="40"/>
+              <w:jc w:val="left"/>
+            </w:pPr>
+            <w:r/>
+            <w:r>
+              <w:rPr>
+                <w:rFonts w:ascii="Montserrat" w:hAnsi="Montserrat" w:eastAsia="Montserrat" w:cs="Montserrat"/>
+                <w:b w:val="0"/>
+                <w:i w:val="0"/>
+                <w:color w:val="1E1E1E"/>
+                <w:sz w:val="18"/>
+              </w:rPr>
+              <w:t>16 px</w:t>
+            </w:r>
+          </w:p>
+        </w:tc>
+        <w:tc>
+          <w:tcPr>
+            <w:tcW w:type="dxa" w:w="1134"/>
+          </w:tcPr>
+          <w:p>
+            <w:pPr>
+              <w:spacing w:lineRule="auto" w:line="276" w:before="40" w:after="40"/>
+              <w:jc w:val="left"/>
+            </w:pPr>
+            <w:r/>
+            <w:r>
+              <w:rPr>
+                <w:rFonts w:ascii="Montserrat" w:hAnsi="Montserrat" w:eastAsia="Montserrat" w:cs="Montserrat"/>
+                <w:b w:val="0"/>
+                <w:i w:val="0"/>
+                <w:color w:val="1E1E1E"/>
+                <w:sz w:val="18"/>
+              </w:rPr>
+              <w:t>500</w:t>
+            </w:r>
+          </w:p>
+        </w:tc>
+        <w:tc>
+          <w:tcPr>
+            <w:tcW w:type="dxa" w:w="1304"/>
+          </w:tcPr>
+          <w:p>
+            <w:pPr>
+              <w:spacing w:lineRule="auto" w:line="276" w:before="40" w:after="40"/>
+              <w:jc w:val="left"/>
+            </w:pPr>
+            <w:r/>
+            <w:r>
+              <w:rPr>
+                <w:rFonts w:ascii="Montserrat" w:hAnsi="Montserrat" w:eastAsia="Montserrat" w:cs="Montserrat"/>
+                <w:b w:val="0"/>
+                <w:i w:val="0"/>
+                <w:color w:val="1E1E1E"/>
+                <w:sz w:val="18"/>
+              </w:rPr>
+              <w:t>1,65</w:t>
+            </w:r>
+          </w:p>
+        </w:tc>
+      </w:tr>
+      <w:tr>
+        <w:tc>
+          <w:tcPr>
+            <w:tcW w:type="dxa" w:w="1474"/>
+          </w:tcPr>
+          <w:p>
+            <w:pPr>
+              <w:spacing w:lineRule="auto" w:line="276" w:before="40" w:after="40"/>
+              <w:jc w:val="left"/>
+            </w:pPr>
+            <w:r/>
+            <w:r>
+              <w:rPr>
+                <w:rFonts w:ascii="Montserrat" w:hAnsi="Montserrat" w:eastAsia="Montserrat" w:cs="Montserrat"/>
+                <w:b/>
+                <w:i w:val="0"/>
+                <w:color w:val="1E1E1E"/>
+                <w:sz w:val="18"/>
+              </w:rPr>
+              <w:t>Surtitre</w:t>
+            </w:r>
+          </w:p>
+        </w:tc>
+        <w:tc>
+          <w:tcPr>
+            <w:tcW w:type="dxa" w:w="2041"/>
+          </w:tcPr>
+          <w:p>
+            <w:pPr>
+              <w:spacing w:lineRule="auto" w:line="276" w:before="40" w:after="40"/>
+              <w:jc w:val="left"/>
+            </w:pPr>
+            <w:r/>
+            <w:r>
+              <w:rPr>
+                <w:rFonts w:ascii="Montserrat" w:hAnsi="Montserrat" w:eastAsia="Montserrat" w:cs="Montserrat"/>
+                <w:b w:val="0"/>
+                <w:i w:val="0"/>
+                <w:color w:val="1E1E1E"/>
+                <w:sz w:val="18"/>
+              </w:rPr>
+              <w:t>Manrope</w:t>
+            </w:r>
+          </w:p>
+        </w:tc>
+        <w:tc>
+          <w:tcPr>
+            <w:tcW w:type="dxa" w:w="1417"/>
+          </w:tcPr>
+          <w:p>
+            <w:pPr>
+              <w:spacing w:lineRule="auto" w:line="276" w:before="40" w:after="40"/>
+              <w:jc w:val="left"/>
+            </w:pPr>
+            <w:r/>
+            <w:r>
+              <w:rPr>
+                <w:rFonts w:ascii="Montserrat" w:hAnsi="Montserrat" w:eastAsia="Montserrat" w:cs="Montserrat"/>
+                <w:b w:val="0"/>
+                <w:i w:val="0"/>
+                <w:color w:val="1E1E1E"/>
+                <w:sz w:val="18"/>
+              </w:rPr>
+              <w:t>12 px</w:t>
+            </w:r>
+          </w:p>
+        </w:tc>
+        <w:tc>
+          <w:tcPr>
+            <w:tcW w:type="dxa" w:w="1417"/>
+          </w:tcPr>
+          <w:p>
+            <w:pPr>
+              <w:spacing w:lineRule="auto" w:line="276" w:before="40" w:after="40"/>
+              <w:jc w:val="left"/>
+            </w:pPr>
+            <w:r/>
+            <w:r>
+              <w:rPr>
+                <w:rFonts w:ascii="Montserrat" w:hAnsi="Montserrat" w:eastAsia="Montserrat" w:cs="Montserrat"/>
+                <w:b w:val="0"/>
+                <w:i w:val="0"/>
+                <w:color w:val="1E1E1E"/>
+                <w:sz w:val="18"/>
+              </w:rPr>
+              <w:t>12 px</w:t>
+            </w:r>
+          </w:p>
+        </w:tc>
+        <w:tc>
+          <w:tcPr>
+            <w:tcW w:type="dxa" w:w="1134"/>
+          </w:tcPr>
+          <w:p>
+            <w:pPr>
+              <w:spacing w:lineRule="auto" w:line="276" w:before="40" w:after="40"/>
+              <w:jc w:val="left"/>
+            </w:pPr>
+            <w:r/>
+            <w:r>
+              <w:rPr>
+                <w:rFonts w:ascii="Montserrat" w:hAnsi="Montserrat" w:eastAsia="Montserrat" w:cs="Montserrat"/>
+                <w:b w:val="0"/>
+                <w:i w:val="0"/>
+                <w:color w:val="1E1E1E"/>
+                <w:sz w:val="18"/>
+              </w:rPr>
+              <w:t>600</w:t>
+            </w:r>
+          </w:p>
+        </w:tc>
+        <w:tc>
+          <w:tcPr>
+            <w:tcW w:type="dxa" w:w="1304"/>
+          </w:tcPr>
+          <w:p>
+            <w:pPr>
+              <w:spacing w:lineRule="auto" w:line="276" w:before="40" w:after="40"/>
+              <w:jc w:val="left"/>
+            </w:pPr>
+            <w:r/>
+            <w:r>
+              <w:rPr>
+                <w:rFonts w:ascii="Montserrat" w:hAnsi="Montserrat" w:eastAsia="Montserrat" w:cs="Montserrat"/>
+                <w:b w:val="0"/>
+                <w:i w:val="0"/>
+                <w:color w:val="1E1E1E"/>
+                <w:sz w:val="18"/>
+              </w:rPr>
+              <w:t>normal</w:t>
+            </w:r>
+          </w:p>
+        </w:tc>
+      </w:tr>
+    </w:tbl>
+    <w:p>
+      <w:pPr>
+        <w:spacing w:lineRule="auto" w:line="360" w:before="160" w:after="40"/>
+        <w:jc w:val="left"/>
+      </w:pPr>
+      <w:r>
+        <w:rPr>
+          <w:rFonts w:ascii="Montserrat" w:hAnsi="Montserrat" w:eastAsia="Montserrat" w:cs="Montserrat"/>
+          <w:b/>
+          <w:i w:val="0"/>
+          <w:color w:val="1E1E1E"/>
+          <w:sz w:val="23"/>
+        </w:rPr>
+        <w:t>Précisions de composition</w:t>
+      </w:r>
+    </w:p>
+    <w:p>
+      <w:pPr>
+        <w:pStyle w:val="ListBullet"/>
+        <w:spacing w:lineRule="auto" w:line="360" w:before="0" w:after="60"/>
+        <w:ind w:left="454"/>
+        <w:jc w:val="both"/>
+      </w:pPr>
+      <w:r>
+        <w:rPr>
+          <w:rFonts w:ascii="Montserrat" w:hAnsi="Montserrat" w:eastAsia="Montserrat" w:cs="Montserrat"/>
+          <w:b/>
+          <w:i w:val="0"/>
+          <w:color w:val="1E1E1E"/>
+          <w:sz w:val="22"/>
+        </w:rPr>
+        <w:t xml:space="preserve">Titres : </w:t>
+      </w:r>
+      <w:r>
+        <w:rPr>
+          <w:rFonts w:ascii="Montserrat" w:hAnsi="Montserrat" w:eastAsia="Montserrat" w:cs="Montserrat"/>
+          <w:b w:val="0"/>
+          <w:i w:val="0"/>
+          <w:color w:val="1E1E1E"/>
+          <w:sz w:val="22"/>
+        </w:rPr>
+        <w:t>les titres portent un interlettrage resserré de 0,005 em, et leur retour à la ligne est équilibré pour éviter qu'un mot seul reste sur la dernière ligne ;</w:t>
+      </w:r>
+    </w:p>
+    <w:p>
+      <w:pPr>
+        <w:pStyle w:val="ListBullet"/>
+        <w:spacing w:lineRule="auto" w:line="360" w:before="0" w:after="60"/>
+        <w:ind w:left="454"/>
+        <w:jc w:val="both"/>
+      </w:pPr>
+      <w:r>
+        <w:rPr>
+          <w:rFonts w:ascii="Montserrat" w:hAnsi="Montserrat" w:eastAsia="Montserrat" w:cs="Montserrat"/>
+          <w:b/>
+          <w:i w:val="0"/>
+          <w:color w:val="1E1E1E"/>
+          <w:sz w:val="22"/>
+        </w:rPr>
+        <w:t xml:space="preserve">Surtitre : </w:t>
+      </w:r>
+      <w:r>
+        <w:rPr>
+          <w:rFonts w:ascii="Montserrat" w:hAnsi="Montserrat" w:eastAsia="Montserrat" w:cs="Montserrat"/>
+          <w:b w:val="0"/>
+          <w:i w:val="0"/>
+          <w:color w:val="1E1E1E"/>
+          <w:sz w:val="22"/>
+        </w:rPr>
+        <w:t>le surtitre s'écrit en capitales, avec un interlettrage de 0,12 em et la couleur laiton de la charte ;</w:t>
+      </w:r>
+    </w:p>
+    <w:p>
+      <w:pPr>
+        <w:pStyle w:val="ListBullet"/>
+        <w:spacing w:lineRule="auto" w:line="360" w:before="0" w:after="60"/>
+        <w:ind w:left="454"/>
+        <w:jc w:val="both"/>
+      </w:pPr>
+      <w:r>
+        <w:rPr>
+          <w:rFonts w:ascii="Montserrat" w:hAnsi="Montserrat" w:eastAsia="Montserrat" w:cs="Montserrat"/>
+          <w:b/>
+          <w:i w:val="0"/>
+          <w:color w:val="1E1E1E"/>
+          <w:sz w:val="22"/>
+        </w:rPr>
+        <w:t xml:space="preserve">Graisse du texte : </w:t>
+      </w:r>
+      <w:r>
+        <w:rPr>
+          <w:rFonts w:ascii="Montserrat" w:hAnsi="Montserrat" w:eastAsia="Montserrat" w:cs="Montserrat"/>
+          <w:b w:val="0"/>
+          <w:i w:val="0"/>
+          <w:color w:val="1E1E1E"/>
+          <w:sz w:val="22"/>
+        </w:rPr>
+        <w:t>le texte courant est composé en graisse 500 et non 400. Manrope est une linéale à fûts fins : à 400, sur fond blanc et dans des tailles de 12 à 17 pixels, le texte se délave ;</w:t>
+      </w:r>
+    </w:p>
+    <w:p>
+      <w:pPr>
+        <w:pStyle w:val="ListBullet"/>
+        <w:spacing w:lineRule="auto" w:line="360" w:before="0" w:after="60"/>
+        <w:ind w:left="454"/>
+        <w:jc w:val="both"/>
+      </w:pPr>
+      <w:r>
+        <w:rPr>
+          <w:rFonts w:ascii="Montserrat" w:hAnsi="Montserrat" w:eastAsia="Montserrat" w:cs="Montserrat"/>
+          <w:b/>
+          <w:i w:val="0"/>
+          <w:color w:val="1E1E1E"/>
+          <w:sz w:val="22"/>
+        </w:rPr>
+        <w:t xml:space="preserve">Accents : </w:t>
+      </w:r>
+      <w:r>
+        <w:rPr>
+          <w:rFonts w:ascii="Montserrat" w:hAnsi="Montserrat" w:eastAsia="Montserrat" w:cs="Montserrat"/>
+          <w:b w:val="0"/>
+          <w:i w:val="0"/>
+          <w:color w:val="1E1E1E"/>
+          <w:sz w:val="22"/>
+        </w:rPr>
+        <w:t>la graisse 600 reste réservée aux libellés et aux prix, pour qu'ils ressortent au dessus du texte courant.</w:t>
+      </w:r>
+    </w:p>
+    <w:tbl>
+      <w:tblPr>
+        <w:tblW w:type="auto" w:w="0"/>
+        <w:jc w:val="center"/>
+        <w:tblLook w:firstColumn="1" w:firstRow="1" w:lastColumn="0" w:lastRow="0" w:noHBand="0" w:noVBand="1" w:val="04A0"/>
+      </w:tblPr>
+      <w:tblGrid>
+        <w:gridCol w:w="9406"/>
+      </w:tblGrid>
+      <w:tr>
+        <w:tc>
+          <w:tcPr>
+            <w:tcW w:type="dxa" w:w="9354"/>
+            <w:shd w:val="clear" w:color="auto" w:fill="F3E8DD"/>
+            <w:tcBorders>
+              <w:left w:val="single" w:sz="18" w:color="0F3B46"/>
+            </w:tcBorders>
+          </w:tcPr>
+          <w:p>
+            <w:pPr>
+              <w:spacing w:lineRule="auto" w:line="312" w:before="80" w:after="80"/>
+              <w:jc w:val="both"/>
+            </w:pPr>
+            <w:r/>
+            <w:r>
+              <w:rPr>
+                <w:rFonts w:ascii="Montserrat" w:hAnsi="Montserrat" w:eastAsia="Montserrat" w:cs="Montserrat"/>
+                <w:b/>
+                <w:i w:val="0"/>
+                <w:color w:val="0F3B46"/>
+                <w:sz w:val="20"/>
+              </w:rPr>
+              <w:t xml:space="preserve">Note de choix, </w:t>
+            </w:r>
+            <w:r>
+              <w:rPr>
+                <w:rFonts w:ascii="Montserrat" w:hAnsi="Montserrat" w:eastAsia="Montserrat" w:cs="Montserrat"/>
+                <w:b w:val="0"/>
+                <w:i/>
+                <w:color w:val="1E1E1E"/>
+                <w:sz w:val="20"/>
+              </w:rPr>
+              <w:t>Le rapport entre le titre principal et le texte courant s'établit à 3,4 fois. Une version antérieure montait à 4,3 fois, avec un corps à 14 pixels et des titres jusqu'à 60 pixels : c'est ce que le retour client décrivait par « textes trop grands ». La correction n'a pas consisté à tout rapetisser, mais à monter le corps de texte et à descendre les titres.</w:t>
+            </w:r>
+          </w:p>
+        </w:tc>
+      </w:tr>
+    </w:tbl>
+    <w:p>
+      <w:pPr>
+        <w:spacing w:after="80"/>
+      </w:pPr>
+    </w:p>
+    <w:tbl>
+      <w:tblPr>
+        <w:tblW w:type="auto" w:w="0"/>
+        <w:jc w:val="center"/>
+        <w:tblLook w:firstColumn="1" w:firstRow="1" w:lastColumn="0" w:lastRow="0" w:noHBand="0" w:noVBand="1" w:val="04A0"/>
+      </w:tblPr>
+      <w:tblGrid>
+        <w:gridCol w:w="9406"/>
+      </w:tblGrid>
+      <w:tr>
+        <w:tc>
+          <w:tcPr>
+            <w:tcW w:type="dxa" w:w="9354"/>
+            <w:shd w:val="clear" w:color="auto" w:fill="F3E8DD"/>
+            <w:tcBorders>
+              <w:left w:val="single" w:sz="18" w:color="0F3B46"/>
+            </w:tcBorders>
+          </w:tcPr>
+          <w:p>
+            <w:pPr>
+              <w:spacing w:lineRule="auto" w:line="312" w:before="80" w:after="80"/>
+              <w:jc w:val="both"/>
+            </w:pPr>
+            <w:r/>
+            <w:r>
+              <w:rPr>
+                <w:rFonts w:ascii="Montserrat" w:hAnsi="Montserrat" w:eastAsia="Montserrat" w:cs="Montserrat"/>
+                <w:b/>
+                <w:i w:val="0"/>
+                <w:color w:val="0F3B46"/>
+                <w:sz w:val="20"/>
+              </w:rPr>
+              <w:t xml:space="preserve">Note de choix, </w:t>
+            </w:r>
+            <w:r>
+              <w:rPr>
+                <w:rFonts w:ascii="Montserrat" w:hAnsi="Montserrat" w:eastAsia="Montserrat" w:cs="Montserrat"/>
+                <w:b w:val="0"/>
+                <w:i/>
+                <w:color w:val="1E1E1E"/>
+                <w:sz w:val="20"/>
+              </w:rPr>
+              <w:t>Les paliers intermédiaires, titre 3, titre 4 et chapô, ont été créés pour la même raison. Sans eux, l'œil saute directement du très grand au très petit, et la page paraît touffue.</w:t>
+            </w:r>
+          </w:p>
+        </w:tc>
+      </w:tr>
+    </w:tbl>
+    <w:p>
+      <w:pPr>
+        <w:spacing w:after="80"/>
+      </w:pPr>
+    </w:p>
+    <w:p>
+      <w:pPr>
+        <w:spacing w:lineRule="auto" w:line="360" w:before="240" w:after="80"/>
+        <w:jc w:val="left"/>
+      </w:pPr>
+      <w:r>
+        <w:rPr>
+          <w:rFonts w:ascii="Montserrat" w:hAnsi="Montserrat" w:eastAsia="Montserrat" w:cs="Montserrat"/>
+          <w:b/>
+          <w:i w:val="0"/>
+          <w:color w:val="0F3B46"/>
+          <w:sz w:val="26"/>
+        </w:rPr>
+        <w:t>1.3 Les couleurs de texte</w:t>
+      </w:r>
+    </w:p>
+    <w:tbl>
+      <w:tblPr>
+        <w:tblStyle w:val="TableGrid"/>
+        <w:tblW w:type="auto" w:w="0"/>
+        <w:jc w:val="center"/>
+        <w:tblLayout w:type="fixed"/>
+        <w:tblLook w:firstColumn="1" w:firstRow="1" w:lastColumn="0" w:lastRow="0" w:noHBand="0" w:noVBand="1" w:val="04A0"/>
+      </w:tblPr>
+      <w:tblGrid>
+        <w:gridCol w:w="3135"/>
+        <w:gridCol w:w="3135"/>
+        <w:gridCol w:w="3135"/>
+      </w:tblGrid>
+      <w:tr>
+        <w:tc>
+          <w:tcPr>
+            <w:tcW w:type="dxa" w:w="2551"/>
+            <w:shd w:val="clear" w:color="auto" w:fill="0F3B46"/>
+          </w:tcPr>
+          <w:p>
+            <w:pPr>
+              <w:spacing w:lineRule="auto" w:line="240" w:before="40" w:after="40"/>
+              <w:jc w:val="left"/>
+            </w:pPr>
+            <w:r/>
+            <w:r>
+              <w:rPr>
+                <w:rFonts w:ascii="Montserrat" w:hAnsi="Montserrat" w:eastAsia="Montserrat" w:cs="Montserrat"/>
+                <w:b/>
+                <w:i w:val="0"/>
+                <w:color w:val="FFFFFF"/>
+                <w:sz w:val="20"/>
+              </w:rPr>
+              <w:t>Usage</w:t>
+            </w:r>
+          </w:p>
+        </w:tc>
+        <w:tc>
+          <w:tcPr>
+            <w:tcW w:type="dxa" w:w="1984"/>
+            <w:shd w:val="clear" w:color="auto" w:fill="0F3B46"/>
+          </w:tcPr>
+          <w:p>
+            <w:pPr>
+              <w:spacing w:lineRule="auto" w:line="240" w:before="40" w:after="40"/>
+              <w:jc w:val="left"/>
+            </w:pPr>
+            <w:r/>
+            <w:r>
+              <w:rPr>
+                <w:rFonts w:ascii="Montserrat" w:hAnsi="Montserrat" w:eastAsia="Montserrat" w:cs="Montserrat"/>
+                <w:b/>
+                <w:i w:val="0"/>
+                <w:color w:val="FFFFFF"/>
+                <w:sz w:val="20"/>
+              </w:rPr>
+              <w:t>Code</w:t>
+            </w:r>
+          </w:p>
+        </w:tc>
+        <w:tc>
+          <w:tcPr>
+            <w:tcW w:type="dxa" w:w="4819"/>
+            <w:shd w:val="clear" w:color="auto" w:fill="0F3B46"/>
+          </w:tcPr>
+          <w:p>
+            <w:pPr>
+              <w:spacing w:lineRule="auto" w:line="240" w:before="40" w:after="40"/>
+              <w:jc w:val="left"/>
+            </w:pPr>
+            <w:r/>
+            <w:r>
+              <w:rPr>
+                <w:rFonts w:ascii="Montserrat" w:hAnsi="Montserrat" w:eastAsia="Montserrat" w:cs="Montserrat"/>
+                <w:b/>
+                <w:i w:val="0"/>
+                <w:color w:val="FFFFFF"/>
+                <w:sz w:val="20"/>
+              </w:rPr>
+              <w:t>Observation</w:t>
+            </w:r>
+          </w:p>
+        </w:tc>
+      </w:tr>
+      <w:tr>
+        <w:tc>
+          <w:tcPr>
+            <w:tcW w:type="dxa" w:w="2551"/>
+          </w:tcPr>
+          <w:p>
+            <w:pPr>
+              <w:spacing w:lineRule="auto" w:line="276" w:before="40" w:after="40"/>
+              <w:jc w:val="left"/>
+            </w:pPr>
+            <w:r/>
+            <w:r>
+              <w:rPr>
+                <w:rFonts w:ascii="Montserrat" w:hAnsi="Montserrat" w:eastAsia="Montserrat" w:cs="Montserrat"/>
+                <w:b/>
+                <w:i w:val="0"/>
+                <w:color w:val="1E1E1E"/>
+                <w:sz w:val="20"/>
+              </w:rPr>
+              <w:t>Texte courant</w:t>
+            </w:r>
+          </w:p>
+        </w:tc>
+        <w:tc>
+          <w:tcPr>
+            <w:tcW w:type="dxa" w:w="1984"/>
+          </w:tcPr>
+          <w:p>
+            <w:pPr>
+              <w:spacing w:lineRule="auto" w:line="276" w:before="40" w:after="40"/>
+              <w:jc w:val="left"/>
+            </w:pPr>
+            <w:r/>
+            <w:r>
+              <w:rPr>
+                <w:rFonts w:ascii="Montserrat" w:hAnsi="Montserrat" w:eastAsia="Montserrat" w:cs="Montserrat"/>
+                <w:b w:val="0"/>
+                <w:i w:val="0"/>
+                <w:color w:val="1E1E1E"/>
+                <w:sz w:val="20"/>
+              </w:rPr>
+              <w:t>#1E1E1E</w:t>
+            </w:r>
+          </w:p>
+        </w:tc>
+        <w:tc>
+          <w:tcPr>
+            <w:tcW w:type="dxa" w:w="4819"/>
+          </w:tcPr>
+          <w:p>
+            <w:pPr>
+              <w:spacing w:lineRule="auto" w:line="276" w:before="40" w:after="40"/>
+              <w:jc w:val="left"/>
+            </w:pPr>
+            <w:r/>
+            <w:r>
+              <w:rPr>
+                <w:rFonts w:ascii="Montserrat" w:hAnsi="Montserrat" w:eastAsia="Montserrat" w:cs="Montserrat"/>
+                <w:b w:val="0"/>
+                <w:i w:val="0"/>
+                <w:color w:val="1E1E1E"/>
+                <w:sz w:val="20"/>
+              </w:rPr>
+              <w:t>Encre de la charte</w:t>
+            </w:r>
+          </w:p>
+        </w:tc>
+      </w:tr>
+      <w:tr>
+        <w:tc>
+          <w:tcPr>
+            <w:tcW w:type="dxa" w:w="2551"/>
+          </w:tcPr>
+          <w:p>
+            <w:pPr>
+              <w:spacing w:lineRule="auto" w:line="276" w:before="40" w:after="40"/>
+              <w:jc w:val="left"/>
+            </w:pPr>
+            <w:r/>
+            <w:r>
+              <w:rPr>
+                <w:rFonts w:ascii="Montserrat" w:hAnsi="Montserrat" w:eastAsia="Montserrat" w:cs="Montserrat"/>
+                <w:b/>
+                <w:i w:val="0"/>
+                <w:color w:val="1E1E1E"/>
+                <w:sz w:val="20"/>
+              </w:rPr>
+              <w:t>Titres et accents</w:t>
+            </w:r>
+          </w:p>
+        </w:tc>
+        <w:tc>
+          <w:tcPr>
+            <w:tcW w:type="dxa" w:w="1984"/>
+          </w:tcPr>
+          <w:p>
+            <w:pPr>
+              <w:spacing w:lineRule="auto" w:line="276" w:before="40" w:after="40"/>
+              <w:jc w:val="left"/>
+            </w:pPr>
+            <w:r/>
+            <w:r>
+              <w:rPr>
+                <w:rFonts w:ascii="Montserrat" w:hAnsi="Montserrat" w:eastAsia="Montserrat" w:cs="Montserrat"/>
+                <w:b w:val="0"/>
+                <w:i w:val="0"/>
+                <w:color w:val="1E1E1E"/>
+                <w:sz w:val="20"/>
+              </w:rPr>
+              <w:t>#0F3B46</w:t>
+            </w:r>
+          </w:p>
+        </w:tc>
+        <w:tc>
+          <w:tcPr>
+            <w:tcW w:type="dxa" w:w="4819"/>
+          </w:tcPr>
+          <w:p>
+            <w:pPr>
+              <w:spacing w:lineRule="auto" w:line="276" w:before="40" w:after="40"/>
+              <w:jc w:val="left"/>
+            </w:pPr>
+            <w:r/>
+            <w:r>
+              <w:rPr>
+                <w:rFonts w:ascii="Montserrat" w:hAnsi="Montserrat" w:eastAsia="Montserrat" w:cs="Montserrat"/>
+                <w:b w:val="0"/>
+                <w:i w:val="0"/>
+                <w:color w:val="1E1E1E"/>
+                <w:sz w:val="20"/>
+              </w:rPr>
+              <w:t>Bleu Profond, couleur primaire</w:t>
+            </w:r>
+          </w:p>
+        </w:tc>
+      </w:tr>
+      <w:tr>
+        <w:tc>
+          <w:tcPr>
+            <w:tcW w:type="dxa" w:w="2551"/>
+          </w:tcPr>
+          <w:p>
+            <w:pPr>
+              <w:spacing w:lineRule="auto" w:line="276" w:before="40" w:after="40"/>
+              <w:jc w:val="left"/>
+            </w:pPr>
+            <w:r/>
+            <w:r>
+              <w:rPr>
+                <w:rFonts w:ascii="Montserrat" w:hAnsi="Montserrat" w:eastAsia="Montserrat" w:cs="Montserrat"/>
+                <w:b/>
+                <w:i w:val="0"/>
+                <w:color w:val="1E1E1E"/>
+                <w:sz w:val="20"/>
+              </w:rPr>
+              <w:t>Fonds clairs</w:t>
+            </w:r>
+          </w:p>
+        </w:tc>
+        <w:tc>
+          <w:tcPr>
+            <w:tcW w:type="dxa" w:w="1984"/>
+          </w:tcPr>
+          <w:p>
+            <w:pPr>
+              <w:spacing w:lineRule="auto" w:line="276" w:before="40" w:after="40"/>
+              <w:jc w:val="left"/>
+            </w:pPr>
+            <w:r/>
+            <w:r>
+              <w:rPr>
+                <w:rFonts w:ascii="Montserrat" w:hAnsi="Montserrat" w:eastAsia="Montserrat" w:cs="Montserrat"/>
+                <w:b w:val="0"/>
+                <w:i w:val="0"/>
+                <w:color w:val="1E1E1E"/>
+                <w:sz w:val="20"/>
+              </w:rPr>
+              <w:t>#F3E8DD</w:t>
+            </w:r>
+          </w:p>
+        </w:tc>
+        <w:tc>
+          <w:tcPr>
+            <w:tcW w:type="dxa" w:w="4819"/>
+          </w:tcPr>
+          <w:p>
+            <w:pPr>
+              <w:spacing w:lineRule="auto" w:line="276" w:before="40" w:after="40"/>
+              <w:jc w:val="left"/>
+            </w:pPr>
+            <w:r/>
+            <w:r>
+              <w:rPr>
+                <w:rFonts w:ascii="Montserrat" w:hAnsi="Montserrat" w:eastAsia="Montserrat" w:cs="Montserrat"/>
+                <w:b w:val="0"/>
+                <w:i w:val="0"/>
+                <w:color w:val="1E1E1E"/>
+                <w:sz w:val="20"/>
+              </w:rPr>
+              <w:t>Beige Sable, couleur secondaire</w:t>
+            </w:r>
+          </w:p>
+        </w:tc>
+      </w:tr>
+      <w:tr>
+        <w:tc>
+          <w:tcPr>
+            <w:tcW w:type="dxa" w:w="2551"/>
+          </w:tcPr>
+          <w:p>
+            <w:pPr>
+              <w:spacing w:lineRule="auto" w:line="276" w:before="40" w:after="40"/>
+              <w:jc w:val="left"/>
+            </w:pPr>
+            <w:r/>
+            <w:r>
+              <w:rPr>
+                <w:rFonts w:ascii="Montserrat" w:hAnsi="Montserrat" w:eastAsia="Montserrat" w:cs="Montserrat"/>
+                <w:b/>
+                <w:i w:val="0"/>
+                <w:color w:val="1E1E1E"/>
+                <w:sz w:val="20"/>
+              </w:rPr>
+              <w:t>Surtitres</w:t>
+            </w:r>
+          </w:p>
+        </w:tc>
+        <w:tc>
+          <w:tcPr>
+            <w:tcW w:type="dxa" w:w="1984"/>
+          </w:tcPr>
+          <w:p>
+            <w:pPr>
+              <w:spacing w:lineRule="auto" w:line="276" w:before="40" w:after="40"/>
+              <w:jc w:val="left"/>
+            </w:pPr>
+            <w:r/>
+            <w:r>
+              <w:rPr>
+                <w:rFonts w:ascii="Montserrat" w:hAnsi="Montserrat" w:eastAsia="Montserrat" w:cs="Montserrat"/>
+                <w:b w:val="0"/>
+                <w:i w:val="0"/>
+                <w:color w:val="1E1E1E"/>
+                <w:sz w:val="20"/>
+              </w:rPr>
+              <w:t>Laiton</w:t>
+            </w:r>
+          </w:p>
+        </w:tc>
+        <w:tc>
+          <w:tcPr>
+            <w:tcW w:type="dxa" w:w="4819"/>
+          </w:tcPr>
+          <w:p>
+            <w:pPr>
+              <w:spacing w:lineRule="auto" w:line="276" w:before="40" w:after="40"/>
+              <w:jc w:val="left"/>
+            </w:pPr>
+            <w:r/>
+            <w:r>
+              <w:rPr>
+                <w:rFonts w:ascii="Montserrat" w:hAnsi="Montserrat" w:eastAsia="Montserrat" w:cs="Montserrat"/>
+                <w:b w:val="0"/>
+                <w:i w:val="0"/>
+                <w:color w:val="1E1E1E"/>
+                <w:sz w:val="20"/>
+              </w:rPr>
+              <w:t>Teinte d'accent, annonce la section</w:t>
+            </w:r>
+          </w:p>
+        </w:tc>
+      </w:tr>
+    </w:tbl>
+    <w:p>
+      <w:r>
+        <w:br w:type="page"/>
+      </w:r>
+    </w:p>
+    <w:p>
+      <w:pPr>
+        <w:spacing w:lineRule="auto" w:line="360" w:before="360" w:after="160"/>
+        <w:jc w:val="left"/>
+        <w:pBdr>
+          <w:bottom w:val="single" w:sz="8" w:space="2" w:color="0F3B46"/>
+        </w:pBdr>
+      </w:pPr>
+      <w:r>
+        <w:rPr>
+          <w:rFonts w:ascii="Montserrat" w:hAnsi="Montserrat" w:eastAsia="Montserrat" w:cs="Montserrat"/>
+          <w:b/>
+          <w:i w:val="0"/>
+          <w:color w:val="0F3B46"/>
+          <w:sz w:val="32"/>
+        </w:rPr>
+        <w:t xml:space="preserve">2. </w:t>
       </w:r>
       <w:r>
         <w:rPr>
@@ -972,7 +3194,7 @@
                 <w:color w:val="0F3B46"/>
                 <w:sz w:val="20"/>
               </w:rPr>
-              <w:t xml:space="preserve">Note de choix — </w:t>
+              <w:t xml:space="preserve">Note de choix, </w:t>
             </w:r>
             <w:r>
               <w:rPr>
@@ -1009,7 +3231,7 @@
           <w:color w:val="0F3B46"/>
           <w:sz w:val="32"/>
         </w:rPr>
-        <w:t xml:space="preserve">2. </w:t>
+        <w:t xml:space="preserve">3. </w:t>
       </w:r>
       <w:r>
         <w:rPr>
@@ -1096,7 +3318,7 @@
           <w:b/>
           <w:sz w:val="18"/>
         </w:rPr>
-        <w:t>├── /soins-visage                      Univers — Soins du visage</w:t>
+        <w:t>├── /soins-visage Univers, Soins du visage</w:t>
       </w:r>
     </w:p>
     <w:p>
@@ -1141,7 +3363,7 @@
           <w:b w:val="0"/>
           <w:sz w:val="18"/>
         </w:rPr>
-        <w:t>│     ├── /traitements                 Catégorie — Sérums &amp; Traitements</w:t>
+        <w:t>│ ├── /traitements Catégorie, Sérums &amp; Traitements</w:t>
       </w:r>
     </w:p>
     <w:p>
@@ -1216,7 +3438,7 @@
           <w:b/>
           <w:sz w:val="18"/>
         </w:rPr>
-        <w:t>├── /corps-hygiene                     Univers — Corps &amp; Hygiène</w:t>
+        <w:t>├── /corps-hygiene Univers, Corps &amp; Hygiène</w:t>
       </w:r>
     </w:p>
     <w:p>
@@ -1231,7 +3453,7 @@
           <w:b w:val="0"/>
           <w:sz w:val="18"/>
         </w:rPr>
-        <w:t>│     ├── /corps                       Catégorie — Soins du corps</w:t>
+        <w:t>│ ├── /corps Catégorie, Soins du corps</w:t>
       </w:r>
     </w:p>
     <w:p>
@@ -1276,7 +3498,7 @@
           <w:b/>
           <w:sz w:val="18"/>
         </w:rPr>
-        <w:t>├── /homme                             Univers — Homme</w:t>
+        <w:t>├── /homme Univers, Homme</w:t>
       </w:r>
     </w:p>
     <w:p>
@@ -1876,7 +4098,7 @@
           <w:b/>
           <w:sz w:val="18"/>
         </w:rPr>
-        <w:t>└── /admin                             Back-office — 38 écrans</w:t>
+        <w:t>└── /admin Back-office, 38 écrans</w:t>
       </w:r>
     </w:p>
     <w:p>
@@ -2579,7 +4801,7 @@
                 <w:color w:val="0F3B46"/>
                 <w:sz w:val="20"/>
               </w:rPr>
-              <w:t xml:space="preserve">Note de choix — </w:t>
+              <w:t xml:space="preserve">Note de choix, </w:t>
             </w:r>
             <w:r>
               <w:rPr>
@@ -2616,7 +4838,7 @@
           <w:color w:val="0F3B46"/>
           <w:sz w:val="32"/>
         </w:rPr>
-        <w:t xml:space="preserve">3. </w:t>
+        <w:t xml:space="preserve">4. </w:t>
       </w:r>
       <w:r>
         <w:rPr>
@@ -2626,7 +4848,7 @@
           <w:color w:val="0F3B46"/>
           <w:sz w:val="32"/>
         </w:rPr>
-        <w:t>ESPACE PUBLIC — LA BOUTIQUE</w:t>
+        <w:t>ESPACE PUBLIC : LA BOUTIQUE</w:t>
       </w:r>
     </w:p>
     <w:p>
@@ -2642,7 +4864,7 @@
           <w:color w:val="0F3B46"/>
           <w:sz w:val="26"/>
         </w:rPr>
-        <w:t>3.1 L'accueil</w:t>
+        <w:t>4.1 L'accueil</w:t>
       </w:r>
     </w:p>
     <w:p>
@@ -2700,7 +4922,7 @@
           <w:color w:val="0F3B46"/>
           <w:sz w:val="26"/>
         </w:rPr>
-        <w:t>3.2 Le catalogue</w:t>
+        <w:t>4.2 Le catalogue</w:t>
       </w:r>
     </w:p>
     <w:p>
@@ -3270,7 +5492,7 @@
           <w:color w:val="1E1E1E"/>
           <w:sz w:val="22"/>
         </w:rPr>
-        <w:t xml:space="preserve">Catégorie — </w:t>
+        <w:t xml:space="preserve">Catégorie, </w:t>
       </w:r>
       <w:r>
         <w:rPr>
@@ -3298,7 +5520,7 @@
           <w:color w:val="1E1E1E"/>
           <w:sz w:val="22"/>
         </w:rPr>
-        <w:t xml:space="preserve">Marque — </w:t>
+        <w:t xml:space="preserve">Marque, </w:t>
       </w:r>
       <w:r>
         <w:rPr>
@@ -3326,7 +5548,7 @@
           <w:color w:val="1E1E1E"/>
           <w:sz w:val="22"/>
         </w:rPr>
-        <w:t xml:space="preserve">Type de peau — </w:t>
+        <w:t xml:space="preserve">Type de peau, </w:t>
       </w:r>
       <w:r>
         <w:rPr>
@@ -3354,7 +5576,7 @@
           <w:color w:val="1E1E1E"/>
           <w:sz w:val="22"/>
         </w:rPr>
-        <w:t xml:space="preserve">Préoccupation — </w:t>
+        <w:t xml:space="preserve">Préoccupation, </w:t>
       </w:r>
       <w:r>
         <w:rPr>
@@ -3382,7 +5604,7 @@
           <w:color w:val="1E1E1E"/>
           <w:sz w:val="22"/>
         </w:rPr>
-        <w:t xml:space="preserve">Prix — </w:t>
+        <w:t xml:space="preserve">Prix, </w:t>
       </w:r>
       <w:r>
         <w:rPr>
@@ -3410,7 +5632,7 @@
           <w:color w:val="1E1E1E"/>
           <w:sz w:val="22"/>
         </w:rPr>
-        <w:t xml:space="preserve">Tri — </w:t>
+        <w:t xml:space="preserve">Tri, </w:t>
       </w:r>
       <w:r>
         <w:rPr>
@@ -3455,7 +5677,7 @@
                 <w:color w:val="0F3B46"/>
                 <w:sz w:val="20"/>
               </w:rPr>
-              <w:t xml:space="preserve">Note de choix — </w:t>
+              <w:t xml:space="preserve">Note de choix, </w:t>
             </w:r>
             <w:r>
               <w:rPr>
@@ -3465,7 +5687,7 @@
                 <w:color w:val="1E1E1E"/>
                 <w:sz w:val="20"/>
               </w:rPr>
-              <w:t>Cocher deux types de peau élargit la sélection ; cocher un type de peau et une préoccupation la restreint. C'est ce qu'un visiteur attend d'une liste de cases : l'inverse viderait le rayon dès le deuxième clic. Chaque case affiche le nombre de produits qu'elle donnerait, et une case à zéro reste visible mais désactivée — une case qui disparaît fait douter de ce qu'on a coché.</w:t>
+              <w:t>Cocher deux types de peau élargit la sélection ; cocher un type de peau et une préoccupation la restreint. C'est ce qu'un visiteur attend d'une liste de cases : l'inverse viderait le rayon dès le deuxième clic. Chaque case affiche le nombre de produits qu'elle donnerait, et une case à zéro reste visible mais désactivée, une case qui disparaît fait douter de ce qu'on a coché.</w:t>
             </w:r>
           </w:p>
         </w:tc>
@@ -3489,7 +5711,7 @@
           <w:color w:val="0F3B46"/>
           <w:sz w:val="26"/>
         </w:rPr>
-        <w:t>3.3 Les marques</w:t>
+        <w:t>4.3 Les marques</w:t>
       </w:r>
     </w:p>
     <w:tbl>
@@ -3745,7 +5967,7 @@
                 <w:color w:val="0F3B46"/>
                 <w:sz w:val="20"/>
               </w:rPr>
-              <w:t xml:space="preserve">Note de choix — </w:t>
+              <w:t xml:space="preserve">Note de choix, </w:t>
             </w:r>
             <w:r>
               <w:rPr>
@@ -3779,7 +6001,7 @@
           <w:color w:val="0F3B46"/>
           <w:sz w:val="26"/>
         </w:rPr>
-        <w:t>3.4 Le diagnostic beauté</w:t>
+        <w:t>4.4 Le diagnostic beauté</w:t>
       </w:r>
     </w:p>
     <w:p>
@@ -3856,7 +6078,7 @@
                 <w:color w:val="0F3B46"/>
                 <w:sz w:val="20"/>
               </w:rPr>
-              <w:t xml:space="preserve">Note de choix — </w:t>
+              <w:t xml:space="preserve">Note de choix, </w:t>
             </w:r>
             <w:r>
               <w:rPr>
@@ -3890,7 +6112,7 @@
           <w:color w:val="0F3B46"/>
           <w:sz w:val="26"/>
         </w:rPr>
-        <w:t>3.5 Les routines</w:t>
+        <w:t>4.5 Les routines</w:t>
       </w:r>
     </w:p>
     <w:tbl>
@@ -4127,7 +6349,7 @@
           <w:color w:val="0F3B46"/>
           <w:sz w:val="26"/>
         </w:rPr>
-        <w:t>3.6 Recherche, favoris et historique</w:t>
+        <w:t>4.6 Recherche, favoris et historique</w:t>
       </w:r>
     </w:p>
     <w:tbl>
@@ -4451,7 +6673,7 @@
                 <w:color w:val="0F3B46"/>
                 <w:sz w:val="20"/>
               </w:rPr>
-              <w:t xml:space="preserve">Note de choix — </w:t>
+              <w:t xml:space="preserve">Note de choix, </w:t>
             </w:r>
             <w:r>
               <w:rPr>
@@ -4485,7 +6707,7 @@
           <w:color w:val="0F3B46"/>
           <w:sz w:val="26"/>
         </w:rPr>
-        <w:t>3.7 Les pages de campagne</w:t>
+        <w:t>4.7 Les pages de campagne</w:t>
       </w:r>
     </w:p>
     <w:p>
@@ -4546,7 +6768,7 @@
           <w:color w:val="0F3B46"/>
           <w:sz w:val="32"/>
         </w:rPr>
-        <w:t xml:space="preserve">4. </w:t>
+        <w:t xml:space="preserve">5. </w:t>
       </w:r>
       <w:r>
         <w:rPr>
@@ -4556,7 +6778,7 @@
           <w:color w:val="0F3B46"/>
           <w:sz w:val="32"/>
         </w:rPr>
-        <w:t>ESPACE CLIENT — LE COMPTE</w:t>
+        <w:t>ESPACE CLIENT : LE COMPTE</w:t>
       </w:r>
     </w:p>
     <w:p>
@@ -5304,7 +7526,7 @@
                 <w:color w:val="0F3B46"/>
                 <w:sz w:val="20"/>
               </w:rPr>
-              <w:t xml:space="preserve">Note de choix — </w:t>
+              <w:t xml:space="preserve">Note de choix, </w:t>
             </w:r>
             <w:r>
               <w:rPr>
@@ -5341,7 +7563,7 @@
           <w:color w:val="0F3B46"/>
           <w:sz w:val="32"/>
         </w:rPr>
-        <w:t xml:space="preserve">5. </w:t>
+        <w:t xml:space="preserve">6. </w:t>
       </w:r>
       <w:r>
         <w:rPr>
@@ -5799,7 +8021,7 @@
                 <w:color w:val="0F3B46"/>
                 <w:sz w:val="20"/>
               </w:rPr>
-              <w:t xml:space="preserve">Note de choix — </w:t>
+              <w:t xml:space="preserve">Note de choix, </w:t>
             </w:r>
             <w:r>
               <w:rPr>
@@ -6113,7 +8335,7 @@
                 <w:color w:val="0F3B46"/>
                 <w:sz w:val="20"/>
               </w:rPr>
-              <w:t xml:space="preserve">Note de choix — </w:t>
+              <w:t xml:space="preserve">Note de choix, </w:t>
             </w:r>
             <w:r>
               <w:rPr>
@@ -6123,514 +8345,7 @@
                 <w:color w:val="1E1E1E"/>
                 <w:sz w:val="20"/>
               </w:rPr>
-              <w:t>Les moyens de paiement s'activent, se désactivent et se réordonnent depuis le back-office. Le prix, le stock et le total sont toujours recalculés par le serveur au moment de la commande — jamais repris du navigateur.</w:t>
-            </w:r>
-          </w:p>
-        </w:tc>
-      </w:tr>
-    </w:tbl>
-    <w:p>
-      <w:pPr>
-        <w:spacing w:after="80"/>
-      </w:pPr>
-    </w:p>
-    <w:p>
-      <w:pPr>
-        <w:spacing w:lineRule="auto" w:line="360" w:before="360" w:after="160"/>
-        <w:jc w:val="left"/>
-        <w:pBdr>
-          <w:bottom w:val="single" w:sz="8" w:space="2" w:color="0F3B46"/>
-        </w:pBdr>
-      </w:pPr>
-      <w:r>
-        <w:rPr>
-          <w:rFonts w:ascii="Montserrat" w:hAnsi="Montserrat" w:eastAsia="Montserrat" w:cs="Montserrat"/>
-          <w:b/>
-          <w:i w:val="0"/>
-          <w:color w:val="0F3B46"/>
-          <w:sz w:val="32"/>
-        </w:rPr>
-        <w:t xml:space="preserve">6. </w:t>
-      </w:r>
-      <w:r>
-        <w:rPr>
-          <w:rFonts w:ascii="Montserrat" w:hAnsi="Montserrat" w:eastAsia="Montserrat" w:cs="Montserrat"/>
-          <w:b/>
-          <w:i w:val="0"/>
-          <w:color w:val="0F3B46"/>
-          <w:sz w:val="32"/>
-        </w:rPr>
-        <w:t>LE JOURNAL — ESPACE ÉDITORIAL</w:t>
-      </w:r>
-    </w:p>
-    <w:tbl>
-      <w:tblPr>
-        <w:tblStyle w:val="TableGrid"/>
-        <w:tblW w:type="auto" w:w="0"/>
-        <w:jc w:val="center"/>
-        <w:tblLayout w:type="fixed"/>
-        <w:tblLook w:firstColumn="1" w:firstRow="1" w:lastColumn="0" w:lastRow="0" w:noHBand="0" w:noVBand="1" w:val="04A0"/>
-      </w:tblPr>
-      <w:tblGrid>
-        <w:gridCol w:w="3135"/>
-        <w:gridCol w:w="3135"/>
-        <w:gridCol w:w="3135"/>
-      </w:tblGrid>
-      <w:tr>
-        <w:tc>
-          <w:tcPr>
-            <w:tcW w:type="dxa" w:w="2268"/>
-            <w:shd w:val="clear" w:color="auto" w:fill="0F3B46"/>
-          </w:tcPr>
-          <w:p>
-            <w:pPr>
-              <w:spacing w:lineRule="auto" w:line="240" w:before="40" w:after="40"/>
-              <w:jc w:val="left"/>
-            </w:pPr>
-            <w:r/>
-            <w:r>
-              <w:rPr>
-                <w:rFonts w:ascii="Montserrat" w:hAnsi="Montserrat" w:eastAsia="Montserrat" w:cs="Montserrat"/>
-                <w:b/>
-                <w:i w:val="0"/>
-                <w:color w:val="FFFFFF"/>
-                <w:sz w:val="20"/>
-              </w:rPr>
-              <w:t>Page</w:t>
-            </w:r>
-          </w:p>
-        </w:tc>
-        <w:tc>
-          <w:tcPr>
-            <w:tcW w:type="dxa" w:w="3118"/>
-            <w:shd w:val="clear" w:color="auto" w:fill="0F3B46"/>
-          </w:tcPr>
-          <w:p>
-            <w:pPr>
-              <w:spacing w:lineRule="auto" w:line="240" w:before="40" w:after="40"/>
-              <w:jc w:val="left"/>
-            </w:pPr>
-            <w:r/>
-            <w:r>
-              <w:rPr>
-                <w:rFonts w:ascii="Montserrat" w:hAnsi="Montserrat" w:eastAsia="Montserrat" w:cs="Montserrat"/>
-                <w:b/>
-                <w:i w:val="0"/>
-                <w:color w:val="FFFFFF"/>
-                <w:sz w:val="20"/>
-              </w:rPr>
-              <w:t>Adresse</w:t>
-            </w:r>
-          </w:p>
-        </w:tc>
-        <w:tc>
-          <w:tcPr>
-            <w:tcW w:type="dxa" w:w="3969"/>
-            <w:shd w:val="clear" w:color="auto" w:fill="0F3B46"/>
-          </w:tcPr>
-          <w:p>
-            <w:pPr>
-              <w:spacing w:lineRule="auto" w:line="240" w:before="40" w:after="40"/>
-              <w:jc w:val="left"/>
-            </w:pPr>
-            <w:r/>
-            <w:r>
-              <w:rPr>
-                <w:rFonts w:ascii="Montserrat" w:hAnsi="Montserrat" w:eastAsia="Montserrat" w:cs="Montserrat"/>
-                <w:b/>
-                <w:i w:val="0"/>
-                <w:color w:val="FFFFFF"/>
-                <w:sz w:val="20"/>
-              </w:rPr>
-              <w:t>Contenu</w:t>
-            </w:r>
-          </w:p>
-        </w:tc>
-      </w:tr>
-      <w:tr>
-        <w:tc>
-          <w:tcPr>
-            <w:tcW w:type="dxa" w:w="2268"/>
-          </w:tcPr>
-          <w:p>
-            <w:pPr>
-              <w:spacing w:lineRule="auto" w:line="276" w:before="40" w:after="40"/>
-              <w:jc w:val="left"/>
-            </w:pPr>
-            <w:r/>
-            <w:r>
-              <w:rPr>
-                <w:rFonts w:ascii="Montserrat" w:hAnsi="Montserrat" w:eastAsia="Montserrat" w:cs="Montserrat"/>
-                <w:b/>
-                <w:i w:val="0"/>
-                <w:color w:val="1E1E1E"/>
-                <w:sz w:val="20"/>
-              </w:rPr>
-              <w:t>Accueil du Journal</w:t>
-            </w:r>
-          </w:p>
-        </w:tc>
-        <w:tc>
-          <w:tcPr>
-            <w:tcW w:type="dxa" w:w="3118"/>
-          </w:tcPr>
-          <w:p>
-            <w:pPr>
-              <w:spacing w:lineRule="auto" w:line="276" w:before="40" w:after="40"/>
-              <w:jc w:val="left"/>
-            </w:pPr>
-            <w:r/>
-            <w:r>
-              <w:rPr>
-                <w:rFonts w:ascii="Montserrat" w:hAnsi="Montserrat" w:eastAsia="Montserrat" w:cs="Montserrat"/>
-                <w:b w:val="0"/>
-                <w:i w:val="0"/>
-                <w:color w:val="1E1E1E"/>
-                <w:sz w:val="20"/>
-              </w:rPr>
-              <w:t>/journal</w:t>
-            </w:r>
-          </w:p>
-        </w:tc>
-        <w:tc>
-          <w:tcPr>
-            <w:tcW w:type="dxa" w:w="3969"/>
-          </w:tcPr>
-          <w:p>
-            <w:pPr>
-              <w:spacing w:lineRule="auto" w:line="276" w:before="40" w:after="40"/>
-              <w:jc w:val="left"/>
-            </w:pPr>
-            <w:r/>
-            <w:r>
-              <w:rPr>
-                <w:rFonts w:ascii="Montserrat" w:hAnsi="Montserrat" w:eastAsia="Montserrat" w:cs="Montserrat"/>
-                <w:b w:val="0"/>
-                <w:i w:val="0"/>
-                <w:color w:val="1E1E1E"/>
-                <w:sz w:val="20"/>
-              </w:rPr>
-              <w:t>Les articles publiés, du plus récent au plus ancien</w:t>
-            </w:r>
-          </w:p>
-        </w:tc>
-      </w:tr>
-      <w:tr>
-        <w:tc>
-          <w:tcPr>
-            <w:tcW w:type="dxa" w:w="2268"/>
-          </w:tcPr>
-          <w:p>
-            <w:pPr>
-              <w:spacing w:lineRule="auto" w:line="276" w:before="40" w:after="40"/>
-              <w:jc w:val="left"/>
-            </w:pPr>
-            <w:r/>
-            <w:r>
-              <w:rPr>
-                <w:rFonts w:ascii="Montserrat" w:hAnsi="Montserrat" w:eastAsia="Montserrat" w:cs="Montserrat"/>
-                <w:b/>
-                <w:i w:val="0"/>
-                <w:color w:val="1E1E1E"/>
-                <w:sz w:val="20"/>
-              </w:rPr>
-              <w:t>Article</w:t>
-            </w:r>
-          </w:p>
-        </w:tc>
-        <w:tc>
-          <w:tcPr>
-            <w:tcW w:type="dxa" w:w="3118"/>
-          </w:tcPr>
-          <w:p>
-            <w:pPr>
-              <w:spacing w:lineRule="auto" w:line="276" w:before="40" w:after="40"/>
-              <w:jc w:val="left"/>
-            </w:pPr>
-            <w:r/>
-            <w:r>
-              <w:rPr>
-                <w:rFonts w:ascii="Montserrat" w:hAnsi="Montserrat" w:eastAsia="Montserrat" w:cs="Montserrat"/>
-                <w:b w:val="0"/>
-                <w:i w:val="0"/>
-                <w:color w:val="1E1E1E"/>
-                <w:sz w:val="20"/>
-              </w:rPr>
-              <w:t>/journal/[article]</w:t>
-            </w:r>
-          </w:p>
-        </w:tc>
-        <w:tc>
-          <w:tcPr>
-            <w:tcW w:type="dxa" w:w="3969"/>
-          </w:tcPr>
-          <w:p>
-            <w:pPr>
-              <w:spacing w:lineRule="auto" w:line="276" w:before="40" w:after="40"/>
-              <w:jc w:val="left"/>
-            </w:pPr>
-            <w:r/>
-            <w:r>
-              <w:rPr>
-                <w:rFonts w:ascii="Montserrat" w:hAnsi="Montserrat" w:eastAsia="Montserrat" w:cs="Montserrat"/>
-                <w:b w:val="0"/>
-                <w:i w:val="0"/>
-                <w:color w:val="1E1E1E"/>
-                <w:sz w:val="20"/>
-              </w:rPr>
-              <w:t>L'article, son auteur et ses produits liés</w:t>
-            </w:r>
-          </w:p>
-        </w:tc>
-      </w:tr>
-      <w:tr>
-        <w:tc>
-          <w:tcPr>
-            <w:tcW w:type="dxa" w:w="2268"/>
-          </w:tcPr>
-          <w:p>
-            <w:pPr>
-              <w:spacing w:lineRule="auto" w:line="276" w:before="40" w:after="40"/>
-              <w:jc w:val="left"/>
-            </w:pPr>
-            <w:r/>
-            <w:r>
-              <w:rPr>
-                <w:rFonts w:ascii="Montserrat" w:hAnsi="Montserrat" w:eastAsia="Montserrat" w:cs="Montserrat"/>
-                <w:b/>
-                <w:i w:val="0"/>
-                <w:color w:val="1E1E1E"/>
-                <w:sz w:val="20"/>
-              </w:rPr>
-              <w:t>Par catégorie</w:t>
-            </w:r>
-          </w:p>
-        </w:tc>
-        <w:tc>
-          <w:tcPr>
-            <w:tcW w:type="dxa" w:w="3118"/>
-          </w:tcPr>
-          <w:p>
-            <w:pPr>
-              <w:spacing w:lineRule="auto" w:line="276" w:before="40" w:after="40"/>
-              <w:jc w:val="left"/>
-            </w:pPr>
-            <w:r/>
-            <w:r>
-              <w:rPr>
-                <w:rFonts w:ascii="Montserrat" w:hAnsi="Montserrat" w:eastAsia="Montserrat" w:cs="Montserrat"/>
-                <w:b w:val="0"/>
-                <w:i w:val="0"/>
-                <w:color w:val="1E1E1E"/>
-                <w:sz w:val="20"/>
-              </w:rPr>
-              <w:t>/journal/categorie/[categorie]</w:t>
-            </w:r>
-          </w:p>
-        </w:tc>
-        <w:tc>
-          <w:tcPr>
-            <w:tcW w:type="dxa" w:w="3969"/>
-          </w:tcPr>
-          <w:p>
-            <w:pPr>
-              <w:spacing w:lineRule="auto" w:line="276" w:before="40" w:after="40"/>
-              <w:jc w:val="left"/>
-            </w:pPr>
-            <w:r/>
-            <w:r>
-              <w:rPr>
-                <w:rFonts w:ascii="Montserrat" w:hAnsi="Montserrat" w:eastAsia="Montserrat" w:cs="Montserrat"/>
-                <w:b w:val="0"/>
-                <w:i w:val="0"/>
-                <w:color w:val="1E1E1E"/>
-                <w:sz w:val="20"/>
-              </w:rPr>
-              <w:t>Les articles d'une catégorie</w:t>
-            </w:r>
-          </w:p>
-        </w:tc>
-      </w:tr>
-      <w:tr>
-        <w:tc>
-          <w:tcPr>
-            <w:tcW w:type="dxa" w:w="2268"/>
-          </w:tcPr>
-          <w:p>
-            <w:pPr>
-              <w:spacing w:lineRule="auto" w:line="276" w:before="40" w:after="40"/>
-              <w:jc w:val="left"/>
-            </w:pPr>
-            <w:r/>
-            <w:r>
-              <w:rPr>
-                <w:rFonts w:ascii="Montserrat" w:hAnsi="Montserrat" w:eastAsia="Montserrat" w:cs="Montserrat"/>
-                <w:b/>
-                <w:i w:val="0"/>
-                <w:color w:val="1E1E1E"/>
-                <w:sz w:val="20"/>
-              </w:rPr>
-              <w:t>Par étiquette</w:t>
-            </w:r>
-          </w:p>
-        </w:tc>
-        <w:tc>
-          <w:tcPr>
-            <w:tcW w:type="dxa" w:w="3118"/>
-          </w:tcPr>
-          <w:p>
-            <w:pPr>
-              <w:spacing w:lineRule="auto" w:line="276" w:before="40" w:after="40"/>
-              <w:jc w:val="left"/>
-            </w:pPr>
-            <w:r/>
-            <w:r>
-              <w:rPr>
-                <w:rFonts w:ascii="Montserrat" w:hAnsi="Montserrat" w:eastAsia="Montserrat" w:cs="Montserrat"/>
-                <w:b w:val="0"/>
-                <w:i w:val="0"/>
-                <w:color w:val="1E1E1E"/>
-                <w:sz w:val="20"/>
-              </w:rPr>
-              <w:t>/journal/tag/[etiquette]</w:t>
-            </w:r>
-          </w:p>
-        </w:tc>
-        <w:tc>
-          <w:tcPr>
-            <w:tcW w:type="dxa" w:w="3969"/>
-          </w:tcPr>
-          <w:p>
-            <w:pPr>
-              <w:spacing w:lineRule="auto" w:line="276" w:before="40" w:after="40"/>
-              <w:jc w:val="left"/>
-            </w:pPr>
-            <w:r/>
-            <w:r>
-              <w:rPr>
-                <w:rFonts w:ascii="Montserrat" w:hAnsi="Montserrat" w:eastAsia="Montserrat" w:cs="Montserrat"/>
-                <w:b w:val="0"/>
-                <w:i w:val="0"/>
-                <w:color w:val="1E1E1E"/>
-                <w:sz w:val="20"/>
-              </w:rPr>
-              <w:t>Les articles portant l'étiquette</w:t>
-            </w:r>
-          </w:p>
-        </w:tc>
-      </w:tr>
-      <w:tr>
-        <w:tc>
-          <w:tcPr>
-            <w:tcW w:type="dxa" w:w="2268"/>
-          </w:tcPr>
-          <w:p>
-            <w:pPr>
-              <w:spacing w:lineRule="auto" w:line="276" w:before="40" w:after="40"/>
-              <w:jc w:val="left"/>
-            </w:pPr>
-            <w:r/>
-            <w:r>
-              <w:rPr>
-                <w:rFonts w:ascii="Montserrat" w:hAnsi="Montserrat" w:eastAsia="Montserrat" w:cs="Montserrat"/>
-                <w:b/>
-                <w:i w:val="0"/>
-                <w:color w:val="1E1E1E"/>
-                <w:sz w:val="20"/>
-              </w:rPr>
-              <w:t>Par auteur</w:t>
-            </w:r>
-          </w:p>
-        </w:tc>
-        <w:tc>
-          <w:tcPr>
-            <w:tcW w:type="dxa" w:w="3118"/>
-          </w:tcPr>
-          <w:p>
-            <w:pPr>
-              <w:spacing w:lineRule="auto" w:line="276" w:before="40" w:after="40"/>
-              <w:jc w:val="left"/>
-            </w:pPr>
-            <w:r/>
-            <w:r>
-              <w:rPr>
-                <w:rFonts w:ascii="Montserrat" w:hAnsi="Montserrat" w:eastAsia="Montserrat" w:cs="Montserrat"/>
-                <w:b w:val="0"/>
-                <w:i w:val="0"/>
-                <w:color w:val="1E1E1E"/>
-                <w:sz w:val="20"/>
-              </w:rPr>
-              <w:t>/journal/auteur/[auteur]</w:t>
-            </w:r>
-          </w:p>
-        </w:tc>
-        <w:tc>
-          <w:tcPr>
-            <w:tcW w:type="dxa" w:w="3969"/>
-          </w:tcPr>
-          <w:p>
-            <w:pPr>
-              <w:spacing w:lineRule="auto" w:line="276" w:before="40" w:after="40"/>
-              <w:jc w:val="left"/>
-            </w:pPr>
-            <w:r/>
-            <w:r>
-              <w:rPr>
-                <w:rFonts w:ascii="Montserrat" w:hAnsi="Montserrat" w:eastAsia="Montserrat" w:cs="Montserrat"/>
-                <w:b w:val="0"/>
-                <w:i w:val="0"/>
-                <w:color w:val="1E1E1E"/>
-                <w:sz w:val="20"/>
-              </w:rPr>
-              <w:t>Les articles d'un auteur</w:t>
-            </w:r>
-          </w:p>
-        </w:tc>
-      </w:tr>
-    </w:tbl>
-    <w:tbl>
-      <w:tblPr>
-        <w:tblW w:type="auto" w:w="0"/>
-        <w:jc w:val="center"/>
-        <w:tblLook w:firstColumn="1" w:firstRow="1" w:lastColumn="0" w:lastRow="0" w:noHBand="0" w:noVBand="1" w:val="04A0"/>
-      </w:tblPr>
-      <w:tblGrid>
-        <w:gridCol w:w="9406"/>
-      </w:tblGrid>
-      <w:tr>
-        <w:tc>
-          <w:tcPr>
-            <w:tcW w:type="dxa" w:w="9354"/>
-            <w:shd w:val="clear" w:color="auto" w:fill="F3E8DD"/>
-            <w:tcBorders>
-              <w:left w:val="single" w:sz="18" w:color="0F3B46"/>
-            </w:tcBorders>
-          </w:tcPr>
-          <w:p>
-            <w:pPr>
-              <w:spacing w:lineRule="auto" w:line="312" w:before="80" w:after="80"/>
-              <w:jc w:val="both"/>
-            </w:pPr>
-            <w:r/>
-            <w:r>
-              <w:rPr>
-                <w:rFonts w:ascii="Montserrat" w:hAnsi="Montserrat" w:eastAsia="Montserrat" w:cs="Montserrat"/>
-                <w:b/>
-                <w:i w:val="0"/>
-                <w:color w:val="0F3B46"/>
-                <w:sz w:val="20"/>
-              </w:rPr>
-              <w:t xml:space="preserve">Note de choix — </w:t>
-            </w:r>
-            <w:r>
-              <w:rPr>
-                <w:rFonts w:ascii="Montserrat" w:hAnsi="Montserrat" w:eastAsia="Montserrat" w:cs="Montserrat"/>
-                <w:b w:val="0"/>
-                <w:i/>
-                <w:color w:val="1E1E1E"/>
-                <w:sz w:val="20"/>
-              </w:rPr>
-              <w:t>Un article peut insérer des blocs produits dans son corps de texte : le Journal sert donc autant à référencer le site qu'à vendre. Ces blocs se mettent à jour automatiquement si le prix ou la disponibilité du produit change.</w:t>
+              <w:t>Les moyens de paiement s'activent, se désactivent et se réordonnent depuis le back-office. Le prix, le stock et le total sont toujours recalculés par le serveur au moment de la commande, jamais repris du navigateur.</w:t>
             </w:r>
           </w:p>
         </w:tc>
@@ -6658,6 +8373,513 @@
           <w:sz w:val="32"/>
         </w:rPr>
         <w:t xml:space="preserve">7. </w:t>
+      </w:r>
+      <w:r>
+        <w:rPr>
+          <w:rFonts w:ascii="Montserrat" w:hAnsi="Montserrat" w:eastAsia="Montserrat" w:cs="Montserrat"/>
+          <w:b/>
+          <w:i w:val="0"/>
+          <w:color w:val="0F3B46"/>
+          <w:sz w:val="32"/>
+        </w:rPr>
+        <w:t>LE JOURNAL : ESPACE ÉDITORIAL</w:t>
+      </w:r>
+    </w:p>
+    <w:tbl>
+      <w:tblPr>
+        <w:tblStyle w:val="TableGrid"/>
+        <w:tblW w:type="auto" w:w="0"/>
+        <w:jc w:val="center"/>
+        <w:tblLayout w:type="fixed"/>
+        <w:tblLook w:firstColumn="1" w:firstRow="1" w:lastColumn="0" w:lastRow="0" w:noHBand="0" w:noVBand="1" w:val="04A0"/>
+      </w:tblPr>
+      <w:tblGrid>
+        <w:gridCol w:w="3135"/>
+        <w:gridCol w:w="3135"/>
+        <w:gridCol w:w="3135"/>
+      </w:tblGrid>
+      <w:tr>
+        <w:tc>
+          <w:tcPr>
+            <w:tcW w:type="dxa" w:w="2268"/>
+            <w:shd w:val="clear" w:color="auto" w:fill="0F3B46"/>
+          </w:tcPr>
+          <w:p>
+            <w:pPr>
+              <w:spacing w:lineRule="auto" w:line="240" w:before="40" w:after="40"/>
+              <w:jc w:val="left"/>
+            </w:pPr>
+            <w:r/>
+            <w:r>
+              <w:rPr>
+                <w:rFonts w:ascii="Montserrat" w:hAnsi="Montserrat" w:eastAsia="Montserrat" w:cs="Montserrat"/>
+                <w:b/>
+                <w:i w:val="0"/>
+                <w:color w:val="FFFFFF"/>
+                <w:sz w:val="20"/>
+              </w:rPr>
+              <w:t>Page</w:t>
+            </w:r>
+          </w:p>
+        </w:tc>
+        <w:tc>
+          <w:tcPr>
+            <w:tcW w:type="dxa" w:w="3118"/>
+            <w:shd w:val="clear" w:color="auto" w:fill="0F3B46"/>
+          </w:tcPr>
+          <w:p>
+            <w:pPr>
+              <w:spacing w:lineRule="auto" w:line="240" w:before="40" w:after="40"/>
+              <w:jc w:val="left"/>
+            </w:pPr>
+            <w:r/>
+            <w:r>
+              <w:rPr>
+                <w:rFonts w:ascii="Montserrat" w:hAnsi="Montserrat" w:eastAsia="Montserrat" w:cs="Montserrat"/>
+                <w:b/>
+                <w:i w:val="0"/>
+                <w:color w:val="FFFFFF"/>
+                <w:sz w:val="20"/>
+              </w:rPr>
+              <w:t>Adresse</w:t>
+            </w:r>
+          </w:p>
+        </w:tc>
+        <w:tc>
+          <w:tcPr>
+            <w:tcW w:type="dxa" w:w="3969"/>
+            <w:shd w:val="clear" w:color="auto" w:fill="0F3B46"/>
+          </w:tcPr>
+          <w:p>
+            <w:pPr>
+              <w:spacing w:lineRule="auto" w:line="240" w:before="40" w:after="40"/>
+              <w:jc w:val="left"/>
+            </w:pPr>
+            <w:r/>
+            <w:r>
+              <w:rPr>
+                <w:rFonts w:ascii="Montserrat" w:hAnsi="Montserrat" w:eastAsia="Montserrat" w:cs="Montserrat"/>
+                <w:b/>
+                <w:i w:val="0"/>
+                <w:color w:val="FFFFFF"/>
+                <w:sz w:val="20"/>
+              </w:rPr>
+              <w:t>Contenu</w:t>
+            </w:r>
+          </w:p>
+        </w:tc>
+      </w:tr>
+      <w:tr>
+        <w:tc>
+          <w:tcPr>
+            <w:tcW w:type="dxa" w:w="2268"/>
+          </w:tcPr>
+          <w:p>
+            <w:pPr>
+              <w:spacing w:lineRule="auto" w:line="276" w:before="40" w:after="40"/>
+              <w:jc w:val="left"/>
+            </w:pPr>
+            <w:r/>
+            <w:r>
+              <w:rPr>
+                <w:rFonts w:ascii="Montserrat" w:hAnsi="Montserrat" w:eastAsia="Montserrat" w:cs="Montserrat"/>
+                <w:b/>
+                <w:i w:val="0"/>
+                <w:color w:val="1E1E1E"/>
+                <w:sz w:val="20"/>
+              </w:rPr>
+              <w:t>Accueil du Journal</w:t>
+            </w:r>
+          </w:p>
+        </w:tc>
+        <w:tc>
+          <w:tcPr>
+            <w:tcW w:type="dxa" w:w="3118"/>
+          </w:tcPr>
+          <w:p>
+            <w:pPr>
+              <w:spacing w:lineRule="auto" w:line="276" w:before="40" w:after="40"/>
+              <w:jc w:val="left"/>
+            </w:pPr>
+            <w:r/>
+            <w:r>
+              <w:rPr>
+                <w:rFonts w:ascii="Montserrat" w:hAnsi="Montserrat" w:eastAsia="Montserrat" w:cs="Montserrat"/>
+                <w:b w:val="0"/>
+                <w:i w:val="0"/>
+                <w:color w:val="1E1E1E"/>
+                <w:sz w:val="20"/>
+              </w:rPr>
+              <w:t>/journal</w:t>
+            </w:r>
+          </w:p>
+        </w:tc>
+        <w:tc>
+          <w:tcPr>
+            <w:tcW w:type="dxa" w:w="3969"/>
+          </w:tcPr>
+          <w:p>
+            <w:pPr>
+              <w:spacing w:lineRule="auto" w:line="276" w:before="40" w:after="40"/>
+              <w:jc w:val="left"/>
+            </w:pPr>
+            <w:r/>
+            <w:r>
+              <w:rPr>
+                <w:rFonts w:ascii="Montserrat" w:hAnsi="Montserrat" w:eastAsia="Montserrat" w:cs="Montserrat"/>
+                <w:b w:val="0"/>
+                <w:i w:val="0"/>
+                <w:color w:val="1E1E1E"/>
+                <w:sz w:val="20"/>
+              </w:rPr>
+              <w:t>Les articles publiés, du plus récent au plus ancien</w:t>
+            </w:r>
+          </w:p>
+        </w:tc>
+      </w:tr>
+      <w:tr>
+        <w:tc>
+          <w:tcPr>
+            <w:tcW w:type="dxa" w:w="2268"/>
+          </w:tcPr>
+          <w:p>
+            <w:pPr>
+              <w:spacing w:lineRule="auto" w:line="276" w:before="40" w:after="40"/>
+              <w:jc w:val="left"/>
+            </w:pPr>
+            <w:r/>
+            <w:r>
+              <w:rPr>
+                <w:rFonts w:ascii="Montserrat" w:hAnsi="Montserrat" w:eastAsia="Montserrat" w:cs="Montserrat"/>
+                <w:b/>
+                <w:i w:val="0"/>
+                <w:color w:val="1E1E1E"/>
+                <w:sz w:val="20"/>
+              </w:rPr>
+              <w:t>Article</w:t>
+            </w:r>
+          </w:p>
+        </w:tc>
+        <w:tc>
+          <w:tcPr>
+            <w:tcW w:type="dxa" w:w="3118"/>
+          </w:tcPr>
+          <w:p>
+            <w:pPr>
+              <w:spacing w:lineRule="auto" w:line="276" w:before="40" w:after="40"/>
+              <w:jc w:val="left"/>
+            </w:pPr>
+            <w:r/>
+            <w:r>
+              <w:rPr>
+                <w:rFonts w:ascii="Montserrat" w:hAnsi="Montserrat" w:eastAsia="Montserrat" w:cs="Montserrat"/>
+                <w:b w:val="0"/>
+                <w:i w:val="0"/>
+                <w:color w:val="1E1E1E"/>
+                <w:sz w:val="20"/>
+              </w:rPr>
+              <w:t>/journal/[article]</w:t>
+            </w:r>
+          </w:p>
+        </w:tc>
+        <w:tc>
+          <w:tcPr>
+            <w:tcW w:type="dxa" w:w="3969"/>
+          </w:tcPr>
+          <w:p>
+            <w:pPr>
+              <w:spacing w:lineRule="auto" w:line="276" w:before="40" w:after="40"/>
+              <w:jc w:val="left"/>
+            </w:pPr>
+            <w:r/>
+            <w:r>
+              <w:rPr>
+                <w:rFonts w:ascii="Montserrat" w:hAnsi="Montserrat" w:eastAsia="Montserrat" w:cs="Montserrat"/>
+                <w:b w:val="0"/>
+                <w:i w:val="0"/>
+                <w:color w:val="1E1E1E"/>
+                <w:sz w:val="20"/>
+              </w:rPr>
+              <w:t>L'article, son auteur et ses produits liés</w:t>
+            </w:r>
+          </w:p>
+        </w:tc>
+      </w:tr>
+      <w:tr>
+        <w:tc>
+          <w:tcPr>
+            <w:tcW w:type="dxa" w:w="2268"/>
+          </w:tcPr>
+          <w:p>
+            <w:pPr>
+              <w:spacing w:lineRule="auto" w:line="276" w:before="40" w:after="40"/>
+              <w:jc w:val="left"/>
+            </w:pPr>
+            <w:r/>
+            <w:r>
+              <w:rPr>
+                <w:rFonts w:ascii="Montserrat" w:hAnsi="Montserrat" w:eastAsia="Montserrat" w:cs="Montserrat"/>
+                <w:b/>
+                <w:i w:val="0"/>
+                <w:color w:val="1E1E1E"/>
+                <w:sz w:val="20"/>
+              </w:rPr>
+              <w:t>Par catégorie</w:t>
+            </w:r>
+          </w:p>
+        </w:tc>
+        <w:tc>
+          <w:tcPr>
+            <w:tcW w:type="dxa" w:w="3118"/>
+          </w:tcPr>
+          <w:p>
+            <w:pPr>
+              <w:spacing w:lineRule="auto" w:line="276" w:before="40" w:after="40"/>
+              <w:jc w:val="left"/>
+            </w:pPr>
+            <w:r/>
+            <w:r>
+              <w:rPr>
+                <w:rFonts w:ascii="Montserrat" w:hAnsi="Montserrat" w:eastAsia="Montserrat" w:cs="Montserrat"/>
+                <w:b w:val="0"/>
+                <w:i w:val="0"/>
+                <w:color w:val="1E1E1E"/>
+                <w:sz w:val="20"/>
+              </w:rPr>
+              <w:t>/journal/categorie/[categorie]</w:t>
+            </w:r>
+          </w:p>
+        </w:tc>
+        <w:tc>
+          <w:tcPr>
+            <w:tcW w:type="dxa" w:w="3969"/>
+          </w:tcPr>
+          <w:p>
+            <w:pPr>
+              <w:spacing w:lineRule="auto" w:line="276" w:before="40" w:after="40"/>
+              <w:jc w:val="left"/>
+            </w:pPr>
+            <w:r/>
+            <w:r>
+              <w:rPr>
+                <w:rFonts w:ascii="Montserrat" w:hAnsi="Montserrat" w:eastAsia="Montserrat" w:cs="Montserrat"/>
+                <w:b w:val="0"/>
+                <w:i w:val="0"/>
+                <w:color w:val="1E1E1E"/>
+                <w:sz w:val="20"/>
+              </w:rPr>
+              <w:t>Les articles d'une catégorie</w:t>
+            </w:r>
+          </w:p>
+        </w:tc>
+      </w:tr>
+      <w:tr>
+        <w:tc>
+          <w:tcPr>
+            <w:tcW w:type="dxa" w:w="2268"/>
+          </w:tcPr>
+          <w:p>
+            <w:pPr>
+              <w:spacing w:lineRule="auto" w:line="276" w:before="40" w:after="40"/>
+              <w:jc w:val="left"/>
+            </w:pPr>
+            <w:r/>
+            <w:r>
+              <w:rPr>
+                <w:rFonts w:ascii="Montserrat" w:hAnsi="Montserrat" w:eastAsia="Montserrat" w:cs="Montserrat"/>
+                <w:b/>
+                <w:i w:val="0"/>
+                <w:color w:val="1E1E1E"/>
+                <w:sz w:val="20"/>
+              </w:rPr>
+              <w:t>Par étiquette</w:t>
+            </w:r>
+          </w:p>
+        </w:tc>
+        <w:tc>
+          <w:tcPr>
+            <w:tcW w:type="dxa" w:w="3118"/>
+          </w:tcPr>
+          <w:p>
+            <w:pPr>
+              <w:spacing w:lineRule="auto" w:line="276" w:before="40" w:after="40"/>
+              <w:jc w:val="left"/>
+            </w:pPr>
+            <w:r/>
+            <w:r>
+              <w:rPr>
+                <w:rFonts w:ascii="Montserrat" w:hAnsi="Montserrat" w:eastAsia="Montserrat" w:cs="Montserrat"/>
+                <w:b w:val="0"/>
+                <w:i w:val="0"/>
+                <w:color w:val="1E1E1E"/>
+                <w:sz w:val="20"/>
+              </w:rPr>
+              <w:t>/journal/tag/[etiquette]</w:t>
+            </w:r>
+          </w:p>
+        </w:tc>
+        <w:tc>
+          <w:tcPr>
+            <w:tcW w:type="dxa" w:w="3969"/>
+          </w:tcPr>
+          <w:p>
+            <w:pPr>
+              <w:spacing w:lineRule="auto" w:line="276" w:before="40" w:after="40"/>
+              <w:jc w:val="left"/>
+            </w:pPr>
+            <w:r/>
+            <w:r>
+              <w:rPr>
+                <w:rFonts w:ascii="Montserrat" w:hAnsi="Montserrat" w:eastAsia="Montserrat" w:cs="Montserrat"/>
+                <w:b w:val="0"/>
+                <w:i w:val="0"/>
+                <w:color w:val="1E1E1E"/>
+                <w:sz w:val="20"/>
+              </w:rPr>
+              <w:t>Les articles portant l'étiquette</w:t>
+            </w:r>
+          </w:p>
+        </w:tc>
+      </w:tr>
+      <w:tr>
+        <w:tc>
+          <w:tcPr>
+            <w:tcW w:type="dxa" w:w="2268"/>
+          </w:tcPr>
+          <w:p>
+            <w:pPr>
+              <w:spacing w:lineRule="auto" w:line="276" w:before="40" w:after="40"/>
+              <w:jc w:val="left"/>
+            </w:pPr>
+            <w:r/>
+            <w:r>
+              <w:rPr>
+                <w:rFonts w:ascii="Montserrat" w:hAnsi="Montserrat" w:eastAsia="Montserrat" w:cs="Montserrat"/>
+                <w:b/>
+                <w:i w:val="0"/>
+                <w:color w:val="1E1E1E"/>
+                <w:sz w:val="20"/>
+              </w:rPr>
+              <w:t>Par auteur</w:t>
+            </w:r>
+          </w:p>
+        </w:tc>
+        <w:tc>
+          <w:tcPr>
+            <w:tcW w:type="dxa" w:w="3118"/>
+          </w:tcPr>
+          <w:p>
+            <w:pPr>
+              <w:spacing w:lineRule="auto" w:line="276" w:before="40" w:after="40"/>
+              <w:jc w:val="left"/>
+            </w:pPr>
+            <w:r/>
+            <w:r>
+              <w:rPr>
+                <w:rFonts w:ascii="Montserrat" w:hAnsi="Montserrat" w:eastAsia="Montserrat" w:cs="Montserrat"/>
+                <w:b w:val="0"/>
+                <w:i w:val="0"/>
+                <w:color w:val="1E1E1E"/>
+                <w:sz w:val="20"/>
+              </w:rPr>
+              <w:t>/journal/auteur/[auteur]</w:t>
+            </w:r>
+          </w:p>
+        </w:tc>
+        <w:tc>
+          <w:tcPr>
+            <w:tcW w:type="dxa" w:w="3969"/>
+          </w:tcPr>
+          <w:p>
+            <w:pPr>
+              <w:spacing w:lineRule="auto" w:line="276" w:before="40" w:after="40"/>
+              <w:jc w:val="left"/>
+            </w:pPr>
+            <w:r/>
+            <w:r>
+              <w:rPr>
+                <w:rFonts w:ascii="Montserrat" w:hAnsi="Montserrat" w:eastAsia="Montserrat" w:cs="Montserrat"/>
+                <w:b w:val="0"/>
+                <w:i w:val="0"/>
+                <w:color w:val="1E1E1E"/>
+                <w:sz w:val="20"/>
+              </w:rPr>
+              <w:t>Les articles d'un auteur</w:t>
+            </w:r>
+          </w:p>
+        </w:tc>
+      </w:tr>
+    </w:tbl>
+    <w:tbl>
+      <w:tblPr>
+        <w:tblW w:type="auto" w:w="0"/>
+        <w:jc w:val="center"/>
+        <w:tblLook w:firstColumn="1" w:firstRow="1" w:lastColumn="0" w:lastRow="0" w:noHBand="0" w:noVBand="1" w:val="04A0"/>
+      </w:tblPr>
+      <w:tblGrid>
+        <w:gridCol w:w="9406"/>
+      </w:tblGrid>
+      <w:tr>
+        <w:tc>
+          <w:tcPr>
+            <w:tcW w:type="dxa" w:w="9354"/>
+            <w:shd w:val="clear" w:color="auto" w:fill="F3E8DD"/>
+            <w:tcBorders>
+              <w:left w:val="single" w:sz="18" w:color="0F3B46"/>
+            </w:tcBorders>
+          </w:tcPr>
+          <w:p>
+            <w:pPr>
+              <w:spacing w:lineRule="auto" w:line="312" w:before="80" w:after="80"/>
+              <w:jc w:val="both"/>
+            </w:pPr>
+            <w:r/>
+            <w:r>
+              <w:rPr>
+                <w:rFonts w:ascii="Montserrat" w:hAnsi="Montserrat" w:eastAsia="Montserrat" w:cs="Montserrat"/>
+                <w:b/>
+                <w:i w:val="0"/>
+                <w:color w:val="0F3B46"/>
+                <w:sz w:val="20"/>
+              </w:rPr>
+              <w:t xml:space="preserve">Note de choix, </w:t>
+            </w:r>
+            <w:r>
+              <w:rPr>
+                <w:rFonts w:ascii="Montserrat" w:hAnsi="Montserrat" w:eastAsia="Montserrat" w:cs="Montserrat"/>
+                <w:b w:val="0"/>
+                <w:i/>
+                <w:color w:val="1E1E1E"/>
+                <w:sz w:val="20"/>
+              </w:rPr>
+              <w:t>Un article peut insérer des blocs produits dans son corps de texte : le Journal sert donc autant à référencer le site qu'à vendre. Ces blocs se mettent à jour automatiquement si le prix ou la disponibilité du produit change.</w:t>
+            </w:r>
+          </w:p>
+        </w:tc>
+      </w:tr>
+    </w:tbl>
+    <w:p>
+      <w:pPr>
+        <w:spacing w:after="80"/>
+      </w:pPr>
+    </w:p>
+    <w:p>
+      <w:pPr>
+        <w:spacing w:lineRule="auto" w:line="360" w:before="360" w:after="160"/>
+        <w:jc w:val="left"/>
+        <w:pBdr>
+          <w:bottom w:val="single" w:sz="8" w:space="2" w:color="0F3B46"/>
+        </w:pBdr>
+      </w:pPr>
+      <w:r>
+        <w:rPr>
+          <w:rFonts w:ascii="Montserrat" w:hAnsi="Montserrat" w:eastAsia="Montserrat" w:cs="Montserrat"/>
+          <w:b/>
+          <w:i w:val="0"/>
+          <w:color w:val="0F3B46"/>
+          <w:sz w:val="32"/>
+        </w:rPr>
+        <w:t xml:space="preserve">8. </w:t>
       </w:r>
       <w:r>
         <w:rPr>
@@ -7228,7 +9450,7 @@
           <w:color w:val="0F3B46"/>
           <w:sz w:val="32"/>
         </w:rPr>
-        <w:t xml:space="preserve">8. </w:t>
+        <w:t xml:space="preserve">9. </w:t>
       </w:r>
       <w:r>
         <w:rPr>
@@ -7238,7 +9460,7 @@
           <w:color w:val="0F3B46"/>
           <w:sz w:val="32"/>
         </w:rPr>
-        <w:t>BACK-OFFICE — L'ADMINISTRATION</w:t>
+        <w:t>BACK-OFFICE : L'ADMINISTRATION</w:t>
       </w:r>
     </w:p>
     <w:p>
@@ -7274,7 +9496,7 @@
           <w:color w:val="1E1E1E"/>
           <w:sz w:val="22"/>
         </w:rPr>
-        <w:t xml:space="preserve">   —   Accès réservé aux comptes administrateurs.</w:t>
+        <w:t xml:space="preserve"> , Accès réservé aux comptes administrateurs.</w:t>
       </w:r>
     </w:p>
     <w:p>
@@ -7306,7 +9528,7 @@
           <w:color w:val="0F3B46"/>
           <w:sz w:val="26"/>
         </w:rPr>
-        <w:t>8.1 Les rôles et leurs droits</w:t>
+        <w:t>9.1 Les rôles et leurs droits</w:t>
       </w:r>
     </w:p>
     <w:tbl>
@@ -8034,7 +10256,7 @@
                 <w:color w:val="0F3B46"/>
                 <w:sz w:val="20"/>
               </w:rPr>
-              <w:t xml:space="preserve">Note de choix — </w:t>
+              <w:t xml:space="preserve">Note de choix, </w:t>
             </w:r>
             <w:r>
               <w:rPr>
@@ -8068,7 +10290,7 @@
           <w:color w:val="0F3B46"/>
           <w:sz w:val="26"/>
         </w:rPr>
-        <w:t>8.2 Vue d'ensemble</w:t>
+        <w:t>9.2 Vue d'ensemble</w:t>
       </w:r>
     </w:p>
     <w:p>
@@ -8126,7 +10348,7 @@
           <w:color w:val="0F3B46"/>
           <w:sz w:val="26"/>
         </w:rPr>
-        <w:t>8.3 Section Catalogue</w:t>
+        <w:t>9.3 Section Catalogue</w:t>
       </w:r>
     </w:p>
     <w:tbl>
@@ -9062,7 +11284,7 @@
                 <w:color w:val="0F3B46"/>
                 <w:sz w:val="20"/>
               </w:rPr>
-              <w:t xml:space="preserve">Note de choix — </w:t>
+              <w:t xml:space="preserve">Note de choix, </w:t>
             </w:r>
             <w:r>
               <w:rPr>
@@ -9072,7 +11294,7 @@
                 <w:color w:val="1E1E1E"/>
                 <w:sz w:val="20"/>
               </w:rPr>
-              <w:t>Le coût d'achat d'un produit peut rester vide, et une case vide n'est pas un coût nul : la marge s'affiche alors « — » plutôt que 100 %. C'est ce qui évite qu'un catalogue non renseigné affiche des marges flatteuses et fausses.</w:t>
+              <w:t>Le coût d'achat d'un produit peut rester vide, et une case vide n'est pas un coût nul : la marge s'affiche alors «, » plutôt que 100 %. C'est ce qui évite qu'un catalogue non renseigné affiche des marges flatteuses et fausses.</w:t>
             </w:r>
           </w:p>
         </w:tc>
@@ -9115,7 +11337,7 @@
                 <w:color w:val="0F3B46"/>
                 <w:sz w:val="20"/>
               </w:rPr>
-              <w:t xml:space="preserve">Note de choix — </w:t>
+              <w:t xml:space="preserve">Note de choix, </w:t>
             </w:r>
             <w:r>
               <w:rPr>
@@ -9149,7 +11371,7 @@
           <w:color w:val="0F3B46"/>
           <w:sz w:val="26"/>
         </w:rPr>
-        <w:t>8.4 Section Boutique</w:t>
+        <w:t>9.4 Section Boutique</w:t>
       </w:r>
     </w:p>
     <w:tbl>
@@ -9813,7 +12035,7 @@
                 <w:color w:val="0F3B46"/>
                 <w:sz w:val="20"/>
               </w:rPr>
-              <w:t xml:space="preserve">Note de choix — </w:t>
+              <w:t xml:space="preserve">Note de choix, </w:t>
             </w:r>
             <w:r>
               <w:rPr>
@@ -9823,7 +12045,7 @@
                 <w:color w:val="1E1E1E"/>
                 <w:sz w:val="20"/>
               </w:rPr>
-              <w:t>Le tableau de bord des ventes distingue deux montants qui ne s'additionnent jamais : l'encaissé, et l'engagé non encore payé. Une commande annulée sort du chiffre d'affaires — la marchandise est revenue en stock — tandis qu'une commande remboursée y reste, puisqu'elle a bien été encaissée avant d'être rendue.</w:t>
+              <w:t>Le tableau de bord des ventes distingue deux montants qui ne s'additionnent jamais : l'encaissé, et l'engagé non encore payé. Une commande annulée sort du chiffre d'affaires, la marchandise est revenue en stock, tandis qu'une commande remboursée y reste, puisqu'elle a bien été encaissée avant d'être rendue.</w:t>
             </w:r>
           </w:p>
         </w:tc>
@@ -9847,7 +12069,7 @@
           <w:color w:val="0F3B46"/>
           <w:sz w:val="26"/>
         </w:rPr>
-        <w:t>8.5 Section Contenu</w:t>
+        <w:t>9.5 Section Contenu</w:t>
       </w:r>
     </w:p>
     <w:tbl>
@@ -10239,7 +12461,7 @@
                 <w:color w:val="0F3B46"/>
                 <w:sz w:val="20"/>
               </w:rPr>
-              <w:t xml:space="preserve">Note de choix — </w:t>
+              <w:t xml:space="preserve">Note de choix, </w:t>
             </w:r>
             <w:r>
               <w:rPr>
@@ -10249,7 +12471,7 @@
                 <w:color w:val="1E1E1E"/>
                 <w:sz w:val="20"/>
               </w:rPr>
-              <w:t>L'écran des traductions inventorie dix-sept types de contenus et une quarantaine de champs traduisibles. Il montre le français à gauche, non modifiable, et l'anglais à droite : on traduit en regardant l'original. Le corps des articles fait exception et se traduit dans l'éditeur d'article — l'écran le signale sur chaque ligne concernée.</w:t>
+              <w:t>L'écran des traductions inventorie dix-sept types de contenus et une quarantaine de champs traduisibles. Il montre le français à gauche, non modifiable, et l'anglais à droite : on traduit en regardant l'original. Le corps des articles fait exception et se traduit dans l'éditeur d'article, l'écran le signale sur chaque ligne concernée.</w:t>
             </w:r>
           </w:p>
         </w:tc>
@@ -10273,7 +12495,7 @@
           <w:color w:val="0F3B46"/>
           <w:sz w:val="26"/>
         </w:rPr>
-        <w:t>8.6 Section Système</w:t>
+        <w:t>9.6 Section Système</w:t>
       </w:r>
     </w:p>
     <w:tbl>
@@ -10665,7 +12887,7 @@
                 <w:color w:val="0F3B46"/>
                 <w:sz w:val="20"/>
               </w:rPr>
-              <w:t xml:space="preserve">Note de choix — </w:t>
+              <w:t xml:space="preserve">Note de choix, </w:t>
             </w:r>
             <w:r>
               <w:rPr>
@@ -10675,7 +12897,7 @@
                 <w:color w:val="1E1E1E"/>
                 <w:sz w:val="20"/>
               </w:rPr>
-              <w:t>Les secrets — jeton de l'API de conversions, clés de paiement — ne se réaffichent jamais après enregistrement : l'écran indique seulement « configuré » ou « non configuré ». Un champ laissé vide conserve la valeur en place, sans quoi chaque enregistrement de l'écran effacerait le secret.</w:t>
+              <w:t>Les secrets, jeton de l'API de conversions, clés de paiement, ne se réaffichent jamais après enregistrement : l'écran indique seulement « configuré » ou « non configuré ». Un champ laissé vide conserve la valeur en place, sans quoi chaque enregistrement de l'écran effacerait le secret.</w:t>
             </w:r>
           </w:p>
         </w:tc>
@@ -10707,7 +12929,7 @@
           <w:color w:val="0F3B46"/>
           <w:sz w:val="32"/>
         </w:rPr>
-        <w:t xml:space="preserve">9. </w:t>
+        <w:t xml:space="preserve">10. </w:t>
       </w:r>
       <w:r>
         <w:rPr>
@@ -11124,7 +13346,7 @@
           <w:color w:val="1E1E1E"/>
           <w:sz w:val="22"/>
         </w:rPr>
-        <w:t xml:space="preserve">Le catalogue — </w:t>
+        <w:t xml:space="preserve">Le catalogue, </w:t>
       </w:r>
       <w:r>
         <w:rPr>
@@ -11152,7 +13374,7 @@
           <w:color w:val="1E1E1E"/>
           <w:sz w:val="22"/>
         </w:rPr>
-        <w:t xml:space="preserve">La navigation — </w:t>
+        <w:t xml:space="preserve">La navigation, </w:t>
       </w:r>
       <w:r>
         <w:rPr>
@@ -11180,7 +13402,7 @@
           <w:color w:val="1E1E1E"/>
           <w:sz w:val="22"/>
         </w:rPr>
-        <w:t xml:space="preserve">Le diagnostic — </w:t>
+        <w:t xml:space="preserve">Le diagnostic, </w:t>
       </w:r>
       <w:r>
         <w:rPr>
@@ -11208,7 +13430,7 @@
           <w:color w:val="1E1E1E"/>
           <w:sz w:val="22"/>
         </w:rPr>
-        <w:t xml:space="preserve">Le Journal — </w:t>
+        <w:t xml:space="preserve">Le Journal, </w:t>
       </w:r>
       <w:r>
         <w:rPr>
@@ -11236,7 +13458,7 @@
           <w:color w:val="1E1E1E"/>
           <w:sz w:val="22"/>
         </w:rPr>
-        <w:t xml:space="preserve">Les pages — </w:t>
+        <w:t xml:space="preserve">Les pages, </w:t>
       </w:r>
       <w:r>
         <w:rPr>
@@ -11264,7 +13486,7 @@
           <w:color w:val="1E1E1E"/>
           <w:sz w:val="22"/>
         </w:rPr>
-        <w:t xml:space="preserve">L'interface — </w:t>
+        <w:t xml:space="preserve">L'interface, </w:t>
       </w:r>
       <w:r>
         <w:rPr>
@@ -11309,7 +13531,7 @@
                 <w:color w:val="0F3B46"/>
                 <w:sz w:val="20"/>
               </w:rPr>
-              <w:t xml:space="preserve">Note de choix — </w:t>
+              <w:t xml:space="preserve">Note de choix, </w:t>
             </w:r>
             <w:r>
               <w:rPr>
@@ -11362,7 +13584,7 @@
                 <w:color w:val="0F3B46"/>
                 <w:sz w:val="20"/>
               </w:rPr>
-              <w:t xml:space="preserve">Note de choix — </w:t>
+              <w:t xml:space="preserve">Note de choix, </w:t>
             </w:r>
             <w:r>
               <w:rPr>
@@ -11399,7 +13621,7 @@
           <w:color w:val="0F3B46"/>
           <w:sz w:val="32"/>
         </w:rPr>
-        <w:t xml:space="preserve">10. </w:t>
+        <w:t xml:space="preserve">11. </w:t>
       </w:r>
       <w:r>
         <w:rPr>
@@ -11409,7 +13631,23 @@
           <w:color w:val="0F3B46"/>
           <w:sz w:val="32"/>
         </w:rPr>
-        <w:t>CHARTE TYPOGRAPHIQUE ET GRAPHIQUE</w:t>
+        <w:t>CHARTE GRAPHIQUE ET MISE EN FORME DU DOCUMENT</w:t>
+      </w:r>
+    </w:p>
+    <w:p>
+      <w:pPr>
+        <w:spacing w:lineRule="auto" w:line="360" w:before="0" w:after="120"/>
+        <w:jc w:val="both"/>
+      </w:pPr>
+      <w:r>
+        <w:rPr>
+          <w:rFonts w:ascii="Montserrat" w:hAnsi="Montserrat" w:eastAsia="Montserrat" w:cs="Montserrat"/>
+          <w:b w:val="0"/>
+          <w:i w:val="0"/>
+          <w:color w:val="1E1E1E"/>
+          <w:sz w:val="22"/>
+        </w:rPr>
+        <w:t>La typographie appliquée aux pages du site est décrite au chapitre 1. Le présent chapitre traite des couleurs de la charte et de la mise en forme de ce document.</w:t>
       </w:r>
     </w:p>
     <w:p>
@@ -11425,7 +13663,7 @@
           <w:color w:val="0F3B46"/>
           <w:sz w:val="26"/>
         </w:rPr>
-        <w:t>10.1 Typographie du site</w:t>
+        <w:t>11.1 Couleurs de la charte</w:t>
       </w:r>
     </w:p>
     <w:tbl>
@@ -11461,13 +13699,13 @@
                 <w:color w:val="FFFFFF"/>
                 <w:sz w:val="20"/>
               </w:rPr>
-              <w:t>Usage</w:t>
-            </w:r>
-          </w:p>
-        </w:tc>
-        <w:tc>
-          <w:tcPr>
-            <w:tcW w:type="dxa" w:w="2835"/>
+              <w:t>Couleur</w:t>
+            </w:r>
+          </w:p>
+        </w:tc>
+        <w:tc>
+          <w:tcPr>
+            <w:tcW w:type="dxa" w:w="1984"/>
             <w:shd w:val="clear" w:color="auto" w:fill="0F3B46"/>
           </w:tcPr>
           <w:p>
@@ -11484,13 +13722,13 @@
                 <w:color w:val="FFFFFF"/>
                 <w:sz w:val="20"/>
               </w:rPr>
-              <w:t>Police</w:t>
-            </w:r>
-          </w:p>
-        </w:tc>
-        <w:tc>
-          <w:tcPr>
-            <w:tcW w:type="dxa" w:w="3969"/>
+              <w:t>Code</w:t>
+            </w:r>
+          </w:p>
+        </w:tc>
+        <w:tc>
+          <w:tcPr>
+            <w:tcW w:type="dxa" w:w="4819"/>
             <w:shd w:val="clear" w:color="auto" w:fill="0F3B46"/>
           </w:tcPr>
           <w:p>
@@ -11507,7 +13745,7 @@
                 <w:color w:val="FFFFFF"/>
                 <w:sz w:val="20"/>
               </w:rPr>
-              <w:t>Observation</w:t>
+              <w:t>Usage</w:t>
             </w:r>
           </w:p>
         </w:tc>
@@ -11531,13 +13769,13 @@
                 <w:color w:val="1E1E1E"/>
                 <w:sz w:val="20"/>
               </w:rPr>
-              <w:t>Titres et logo</w:t>
-            </w:r>
-          </w:p>
-        </w:tc>
-        <w:tc>
-          <w:tcPr>
-            <w:tcW w:type="dxa" w:w="2835"/>
+              <w:t>Bleu Profond</w:t>
+            </w:r>
+          </w:p>
+        </w:tc>
+        <w:tc>
+          <w:tcPr>
+            <w:tcW w:type="dxa" w:w="1984"/>
           </w:tcPr>
           <w:p>
             <w:pPr>
@@ -11553,13 +13791,13 @@
                 <w:color w:val="1E1E1E"/>
                 <w:sz w:val="20"/>
               </w:rPr>
-              <w:t>Cinzel</w:t>
-            </w:r>
-          </w:p>
-        </w:tc>
-        <w:tc>
-          <w:tcPr>
-            <w:tcW w:type="dxa" w:w="3969"/>
+              <w:t>#0F3B46</w:t>
+            </w:r>
+          </w:p>
+        </w:tc>
+        <w:tc>
+          <w:tcPr>
+            <w:tcW w:type="dxa" w:w="4819"/>
           </w:tcPr>
           <w:p>
             <w:pPr>
@@ -11575,7 +13813,7 @@
                 <w:color w:val="1E1E1E"/>
                 <w:sz w:val="20"/>
               </w:rPr>
-              <w:t>Police libre</w:t>
+              <w:t>Couleur primaire, titres, boutons, accents</w:t>
             </w:r>
           </w:p>
         </w:tc>
@@ -11599,13 +13837,13 @@
                 <w:color w:val="1E1E1E"/>
                 <w:sz w:val="20"/>
               </w:rPr>
-              <w:t>Texte courant</w:t>
-            </w:r>
-          </w:p>
-        </w:tc>
-        <w:tc>
-          <w:tcPr>
-            <w:tcW w:type="dxa" w:w="2835"/>
+              <w:t>Beige Sable</w:t>
+            </w:r>
+          </w:p>
+        </w:tc>
+        <w:tc>
+          <w:tcPr>
+            <w:tcW w:type="dxa" w:w="1984"/>
           </w:tcPr>
           <w:p>
             <w:pPr>
@@ -11621,13 +13859,13 @@
                 <w:color w:val="1E1E1E"/>
                 <w:sz w:val="20"/>
               </w:rPr>
-              <w:t>Gilroy</w:t>
-            </w:r>
-          </w:p>
-        </w:tc>
-        <w:tc>
-          <w:tcPr>
-            <w:tcW w:type="dxa" w:w="3969"/>
+              <w:t>#F3E8DD</w:t>
+            </w:r>
+          </w:p>
+        </w:tc>
+        <w:tc>
+          <w:tcPr>
+            <w:tcW w:type="dxa" w:w="4819"/>
           </w:tcPr>
           <w:p>
             <w:pPr>
@@ -11643,365 +13881,7 @@
                 <w:color w:val="1E1E1E"/>
                 <w:sz w:val="20"/>
               </w:rPr>
-              <w:t>Police commerciale — licence à acquérir</w:t>
-            </w:r>
-          </w:p>
-        </w:tc>
-      </w:tr>
-      <w:tr>
-        <w:tc>
-          <w:tcPr>
-            <w:tcW w:type="dxa" w:w="2551"/>
-          </w:tcPr>
-          <w:p>
-            <w:pPr>
-              <w:spacing w:lineRule="auto" w:line="276" w:before="40" w:after="40"/>
-              <w:jc w:val="left"/>
-            </w:pPr>
-            <w:r/>
-            <w:r>
-              <w:rPr>
-                <w:rFonts w:ascii="Montserrat" w:hAnsi="Montserrat" w:eastAsia="Montserrat" w:cs="Montserrat"/>
-                <w:b/>
-                <w:i w:val="0"/>
-                <w:color w:val="1E1E1E"/>
-                <w:sz w:val="20"/>
-              </w:rPr>
-              <w:t>Substituts envisagés</w:t>
-            </w:r>
-          </w:p>
-        </w:tc>
-        <w:tc>
-          <w:tcPr>
-            <w:tcW w:type="dxa" w:w="2835"/>
-          </w:tcPr>
-          <w:p>
-            <w:pPr>
-              <w:spacing w:lineRule="auto" w:line="276" w:before="40" w:after="40"/>
-              <w:jc w:val="left"/>
-            </w:pPr>
-            <w:r/>
-            <w:r>
-              <w:rPr>
-                <w:rFonts w:ascii="Montserrat" w:hAnsi="Montserrat" w:eastAsia="Montserrat" w:cs="Montserrat"/>
-                <w:b w:val="0"/>
-                <w:i w:val="0"/>
-                <w:color w:val="1E1E1E"/>
-                <w:sz w:val="20"/>
-              </w:rPr>
-              <w:t>Manrope, Sora, Poppins</w:t>
-            </w:r>
-          </w:p>
-        </w:tc>
-        <w:tc>
-          <w:tcPr>
-            <w:tcW w:type="dxa" w:w="3969"/>
-          </w:tcPr>
-          <w:p>
-            <w:pPr>
-              <w:spacing w:lineRule="auto" w:line="276" w:before="40" w:after="40"/>
-              <w:jc w:val="left"/>
-            </w:pPr>
-            <w:r/>
-            <w:r>
-              <w:rPr>
-                <w:rFonts w:ascii="Montserrat" w:hAnsi="Montserrat" w:eastAsia="Montserrat" w:cs="Montserrat"/>
-                <w:b w:val="0"/>
-                <w:i w:val="0"/>
-                <w:color w:val="1E1E1E"/>
-                <w:sz w:val="20"/>
-              </w:rPr>
-              <w:t>Libres, visuellement proches de Gilroy</w:t>
-            </w:r>
-          </w:p>
-        </w:tc>
-      </w:tr>
-    </w:tbl>
-    <w:tbl>
-      <w:tblPr>
-        <w:tblW w:type="auto" w:w="0"/>
-        <w:jc w:val="center"/>
-        <w:tblLook w:firstColumn="1" w:firstRow="1" w:lastColumn="0" w:lastRow="0" w:noHBand="0" w:noVBand="1" w:val="04A0"/>
-      </w:tblPr>
-      <w:tblGrid>
-        <w:gridCol w:w="9406"/>
-      </w:tblGrid>
-      <w:tr>
-        <w:tc>
-          <w:tcPr>
-            <w:tcW w:type="dxa" w:w="9354"/>
-            <w:shd w:val="clear" w:color="auto" w:fill="F3E8DD"/>
-            <w:tcBorders>
-              <w:left w:val="single" w:sz="18" w:color="0F3B46"/>
-            </w:tcBorders>
-          </w:tcPr>
-          <w:p>
-            <w:pPr>
-              <w:spacing w:lineRule="auto" w:line="312" w:before="80" w:after="80"/>
-              <w:jc w:val="both"/>
-            </w:pPr>
-            <w:r/>
-            <w:r>
-              <w:rPr>
-                <w:rFonts w:ascii="Montserrat" w:hAnsi="Montserrat" w:eastAsia="Montserrat" w:cs="Montserrat"/>
-                <w:b/>
-                <w:i w:val="0"/>
-                <w:color w:val="0F3B46"/>
-                <w:sz w:val="20"/>
-              </w:rPr>
-              <w:t xml:space="preserve">Note de choix — </w:t>
-            </w:r>
-            <w:r>
-              <w:rPr>
-                <w:rFonts w:ascii="Montserrat" w:hAnsi="Montserrat" w:eastAsia="Montserrat" w:cs="Montserrat"/>
-                <w:b w:val="0"/>
-                <w:i/>
-                <w:color w:val="1E1E1E"/>
-                <w:sz w:val="20"/>
-              </w:rPr>
-              <w:t>Gilroy est une police commerciale. Tant que sa licence web n'est pas acquise, le site doit utiliser l'un des trois substituts libres. Ce choix reste à trancher et figure parmi les informations attendues au chapitre 11.</w:t>
-            </w:r>
-          </w:p>
-        </w:tc>
-      </w:tr>
-    </w:tbl>
-    <w:p>
-      <w:pPr>
-        <w:spacing w:after="80"/>
-      </w:pPr>
-    </w:p>
-    <w:p>
-      <w:pPr>
-        <w:spacing w:lineRule="auto" w:line="360" w:before="240" w:after="80"/>
-        <w:jc w:val="left"/>
-      </w:pPr>
-      <w:r>
-        <w:rPr>
-          <w:rFonts w:ascii="Montserrat" w:hAnsi="Montserrat" w:eastAsia="Montserrat" w:cs="Montserrat"/>
-          <w:b/>
-          <w:i w:val="0"/>
-          <w:color w:val="0F3B46"/>
-          <w:sz w:val="26"/>
-        </w:rPr>
-        <w:t>10.2 Couleurs de la charte</w:t>
-      </w:r>
-    </w:p>
-    <w:tbl>
-      <w:tblPr>
-        <w:tblStyle w:val="TableGrid"/>
-        <w:tblW w:type="auto" w:w="0"/>
-        <w:jc w:val="center"/>
-        <w:tblLayout w:type="fixed"/>
-        <w:tblLook w:firstColumn="1" w:firstRow="1" w:lastColumn="0" w:lastRow="0" w:noHBand="0" w:noVBand="1" w:val="04A0"/>
-      </w:tblPr>
-      <w:tblGrid>
-        <w:gridCol w:w="3135"/>
-        <w:gridCol w:w="3135"/>
-        <w:gridCol w:w="3135"/>
-      </w:tblGrid>
-      <w:tr>
-        <w:tc>
-          <w:tcPr>
-            <w:tcW w:type="dxa" w:w="2551"/>
-            <w:shd w:val="clear" w:color="auto" w:fill="0F3B46"/>
-          </w:tcPr>
-          <w:p>
-            <w:pPr>
-              <w:spacing w:lineRule="auto" w:line="240" w:before="40" w:after="40"/>
-              <w:jc w:val="left"/>
-            </w:pPr>
-            <w:r/>
-            <w:r>
-              <w:rPr>
-                <w:rFonts w:ascii="Montserrat" w:hAnsi="Montserrat" w:eastAsia="Montserrat" w:cs="Montserrat"/>
-                <w:b/>
-                <w:i w:val="0"/>
-                <w:color w:val="FFFFFF"/>
-                <w:sz w:val="20"/>
-              </w:rPr>
-              <w:t>Couleur</w:t>
-            </w:r>
-          </w:p>
-        </w:tc>
-        <w:tc>
-          <w:tcPr>
-            <w:tcW w:type="dxa" w:w="1984"/>
-            <w:shd w:val="clear" w:color="auto" w:fill="0F3B46"/>
-          </w:tcPr>
-          <w:p>
-            <w:pPr>
-              <w:spacing w:lineRule="auto" w:line="240" w:before="40" w:after="40"/>
-              <w:jc w:val="left"/>
-            </w:pPr>
-            <w:r/>
-            <w:r>
-              <w:rPr>
-                <w:rFonts w:ascii="Montserrat" w:hAnsi="Montserrat" w:eastAsia="Montserrat" w:cs="Montserrat"/>
-                <w:b/>
-                <w:i w:val="0"/>
-                <w:color w:val="FFFFFF"/>
-                <w:sz w:val="20"/>
-              </w:rPr>
-              <w:t>Code</w:t>
-            </w:r>
-          </w:p>
-        </w:tc>
-        <w:tc>
-          <w:tcPr>
-            <w:tcW w:type="dxa" w:w="4819"/>
-            <w:shd w:val="clear" w:color="auto" w:fill="0F3B46"/>
-          </w:tcPr>
-          <w:p>
-            <w:pPr>
-              <w:spacing w:lineRule="auto" w:line="240" w:before="40" w:after="40"/>
-              <w:jc w:val="left"/>
-            </w:pPr>
-            <w:r/>
-            <w:r>
-              <w:rPr>
-                <w:rFonts w:ascii="Montserrat" w:hAnsi="Montserrat" w:eastAsia="Montserrat" w:cs="Montserrat"/>
-                <w:b/>
-                <w:i w:val="0"/>
-                <w:color w:val="FFFFFF"/>
-                <w:sz w:val="20"/>
-              </w:rPr>
-              <w:t>Usage</w:t>
-            </w:r>
-          </w:p>
-        </w:tc>
-      </w:tr>
-      <w:tr>
-        <w:tc>
-          <w:tcPr>
-            <w:tcW w:type="dxa" w:w="2551"/>
-          </w:tcPr>
-          <w:p>
-            <w:pPr>
-              <w:spacing w:lineRule="auto" w:line="276" w:before="40" w:after="40"/>
-              <w:jc w:val="left"/>
-            </w:pPr>
-            <w:r/>
-            <w:r>
-              <w:rPr>
-                <w:rFonts w:ascii="Montserrat" w:hAnsi="Montserrat" w:eastAsia="Montserrat" w:cs="Montserrat"/>
-                <w:b/>
-                <w:i w:val="0"/>
-                <w:color w:val="1E1E1E"/>
-                <w:sz w:val="20"/>
-              </w:rPr>
-              <w:t>Bleu Profond</w:t>
-            </w:r>
-          </w:p>
-        </w:tc>
-        <w:tc>
-          <w:tcPr>
-            <w:tcW w:type="dxa" w:w="1984"/>
-          </w:tcPr>
-          <w:p>
-            <w:pPr>
-              <w:spacing w:lineRule="auto" w:line="276" w:before="40" w:after="40"/>
-              <w:jc w:val="left"/>
-            </w:pPr>
-            <w:r/>
-            <w:r>
-              <w:rPr>
-                <w:rFonts w:ascii="Montserrat" w:hAnsi="Montserrat" w:eastAsia="Montserrat" w:cs="Montserrat"/>
-                <w:b w:val="0"/>
-                <w:i w:val="0"/>
-                <w:color w:val="1E1E1E"/>
-                <w:sz w:val="20"/>
-              </w:rPr>
-              <w:t>#0F3B46</w:t>
-            </w:r>
-          </w:p>
-        </w:tc>
-        <w:tc>
-          <w:tcPr>
-            <w:tcW w:type="dxa" w:w="4819"/>
-          </w:tcPr>
-          <w:p>
-            <w:pPr>
-              <w:spacing w:lineRule="auto" w:line="276" w:before="40" w:after="40"/>
-              <w:jc w:val="left"/>
-            </w:pPr>
-            <w:r/>
-            <w:r>
-              <w:rPr>
-                <w:rFonts w:ascii="Montserrat" w:hAnsi="Montserrat" w:eastAsia="Montserrat" w:cs="Montserrat"/>
-                <w:b w:val="0"/>
-                <w:i w:val="0"/>
-                <w:color w:val="1E1E1E"/>
-                <w:sz w:val="20"/>
-              </w:rPr>
-              <w:t>Couleur primaire — titres, boutons, accents</w:t>
-            </w:r>
-          </w:p>
-        </w:tc>
-      </w:tr>
-      <w:tr>
-        <w:tc>
-          <w:tcPr>
-            <w:tcW w:type="dxa" w:w="2551"/>
-          </w:tcPr>
-          <w:p>
-            <w:pPr>
-              <w:spacing w:lineRule="auto" w:line="276" w:before="40" w:after="40"/>
-              <w:jc w:val="left"/>
-            </w:pPr>
-            <w:r/>
-            <w:r>
-              <w:rPr>
-                <w:rFonts w:ascii="Montserrat" w:hAnsi="Montserrat" w:eastAsia="Montserrat" w:cs="Montserrat"/>
-                <w:b/>
-                <w:i w:val="0"/>
-                <w:color w:val="1E1E1E"/>
-                <w:sz w:val="20"/>
-              </w:rPr>
-              <w:t>Beige Sable</w:t>
-            </w:r>
-          </w:p>
-        </w:tc>
-        <w:tc>
-          <w:tcPr>
-            <w:tcW w:type="dxa" w:w="1984"/>
-          </w:tcPr>
-          <w:p>
-            <w:pPr>
-              <w:spacing w:lineRule="auto" w:line="276" w:before="40" w:after="40"/>
-              <w:jc w:val="left"/>
-            </w:pPr>
-            <w:r/>
-            <w:r>
-              <w:rPr>
-                <w:rFonts w:ascii="Montserrat" w:hAnsi="Montserrat" w:eastAsia="Montserrat" w:cs="Montserrat"/>
-                <w:b w:val="0"/>
-                <w:i w:val="0"/>
-                <w:color w:val="1E1E1E"/>
-                <w:sz w:val="20"/>
-              </w:rPr>
-              <w:t>#F3E8DD</w:t>
-            </w:r>
-          </w:p>
-        </w:tc>
-        <w:tc>
-          <w:tcPr>
-            <w:tcW w:type="dxa" w:w="4819"/>
-          </w:tcPr>
-          <w:p>
-            <w:pPr>
-              <w:spacing w:lineRule="auto" w:line="276" w:before="40" w:after="40"/>
-              <w:jc w:val="left"/>
-            </w:pPr>
-            <w:r/>
-            <w:r>
-              <w:rPr>
-                <w:rFonts w:ascii="Montserrat" w:hAnsi="Montserrat" w:eastAsia="Montserrat" w:cs="Montserrat"/>
-                <w:b w:val="0"/>
-                <w:i w:val="0"/>
-                <w:color w:val="1E1E1E"/>
-                <w:sz w:val="20"/>
-              </w:rPr>
-              <w:t>Couleur secondaire — fonds, encadrés</w:t>
+              <w:t>Couleur secondaire, fonds, encadrés</w:t>
             </w:r>
           </w:p>
         </w:tc>
@@ -12156,7 +14036,7 @@
           <w:color w:val="0F3B46"/>
           <w:sz w:val="26"/>
         </w:rPr>
-        <w:t>10.3 Mise en forme du présent document</w:t>
+        <w:t>11.2 Mise en forme du présent document</w:t>
       </w:r>
     </w:p>
     <w:tbl>
@@ -12609,7 +14489,7 @@
           <w:color w:val="0F3B46"/>
           <w:sz w:val="32"/>
         </w:rPr>
-        <w:t xml:space="preserve">11. </w:t>
+        <w:t xml:space="preserve">12. </w:t>
       </w:r>
       <w:r>
         <w:rPr>
@@ -12651,7 +14531,7 @@
           <w:color w:val="0F3B46"/>
           <w:sz w:val="26"/>
         </w:rPr>
-        <w:t>11.1 Bloquant — le site ne peut pas ouvrir sans cela</w:t>
+        <w:t>12.1 Bloquant, le site ne peut pas ouvrir sans cela</w:t>
       </w:r>
     </w:p>
     <w:tbl>
@@ -12912,7 +14792,7 @@
           <w:color w:val="0F3B46"/>
           <w:sz w:val="26"/>
         </w:rPr>
-        <w:t>11.2 Important — le site fonctionne, mais en aveugle</w:t>
+        <w:t>12.2 Important, le site fonctionne, mais en aveugle</w:t>
       </w:r>
     </w:p>
     <w:tbl>
@@ -13173,7 +15053,7 @@
           <w:color w:val="0F3B46"/>
           <w:sz w:val="26"/>
         </w:rPr>
-        <w:t>11.3 À trancher avec le comptable</w:t>
+        <w:t>12.3 À trancher avec le comptable</w:t>
       </w:r>
     </w:p>
     <w:tbl>
@@ -13480,7 +15360,7 @@
           <w:color w:val="0F3B46"/>
           <w:sz w:val="26"/>
         </w:rPr>
-        <w:t>11.4 Contenus attendus</w:t>
+        <w:t>12.4 Contenus attendus</w:t>
       </w:r>
     </w:p>
     <w:tbl>
@@ -13741,7 +15621,7 @@
           <w:color w:val="0F3B46"/>
           <w:sz w:val="26"/>
         </w:rPr>
-        <w:t>11.5 Points non traités à ce jour</w:t>
+        <w:t>12.5 Points non traités à ce jour</w:t>
       </w:r>
     </w:p>
     <w:p>
@@ -13956,7 +15836,7 @@
         <w:color w:val="5A5A5A"/>
         <w:sz w:val="16"/>
       </w:rPr>
-      <w:t xml:space="preserve">KossKoss Select — Structure du site   |   Page </w:t>
+      <w:t xml:space="preserve">KossKoss Select, Structure du site | Page </w:t>
     </w:r>
     <w:r>
       <w:rPr>

</xml_diff>